<commit_message>
formatting + small fixes
</commit_message>
<xml_diff>
--- a/paper/james/cerovsky_practical_training_guide_sk.docx
+++ b/paper/james/cerovsky_practical_training_guide_sk.docx
@@ -205,7 +205,7 @@
           <w:color w:val="1F3864"/>
           <w:sz w:val="40"/>
         </w:rPr>
-        <w:t>Biomechanická príručka pre tréning prstov a prevenciu zranení v športovom lezení</w:t>
+        <w:t>Odporúčania pre tréning prstov na základe biomechanického modelovania morfotypu prsta</w:t>
         <w:br/>
       </w:r>
       <w:r>
@@ -476,7 +476,7 @@
           <w:i w:val="0"/>
           <w:sz w:val="32"/>
         </w:rPr>
-        <w:t>Igor Cerovský</w:t>
+        <w:t>Mgr. Igor Cerovský PhD.</w:t>
       </w:r>
     </w:p>
     <w:p>
@@ -532,6 +532,8 @@
         <w:p>
           <w:pPr>
             <w:pStyle w:val="Obsah1"/>
+            <w:ind w:left="0" w:firstLine="0"/>
+            <w:jc w:val="left"/>
             <w:rPr>
               <w:b/>
               <w:bCs/>
@@ -542,7 +544,7 @@
               <w:b/>
               <w:bCs/>
             </w:rPr>
-            <w:t>Úvod</w:t>
+            <w:t>Úvod: Prepojenie biomechaniky s lezeckou praxou</w:t>
           </w:r>
           <w:r>
             <w:ptab w:relativeTo="margin" w:alignment="right" w:leader="dot"/>
@@ -558,6 +560,8 @@
         <w:p>
           <w:pPr>
             <w:pStyle w:val="Obsah1"/>
+            <w:ind w:left="0" w:firstLine="0"/>
+            <w:jc w:val="left"/>
             <w:rPr>
               <w:b/>
               <w:bCs/>
@@ -584,10 +588,11 @@
         <w:p>
           <w:pPr>
             <w:pStyle w:val="Obsah2"/>
-            <w:ind w:left="216"/>
+            <w:ind w:left="216" w:firstLine="0"/>
+            <w:jc w:val="left"/>
           </w:pPr>
           <w:r>
-            <w:t>1.1 Rozpočtovanie úchopového zaťaženia – „pútka-chrániaci“ otvorený úchop</w:t>
+            <w:t>1.1 Dávkovanie úchopov a otvorený úchop ako ochrana pútok</w:t>
           </w:r>
           <w:r>
             <w:ptab w:relativeTo="margin" w:alignment="right" w:leader="dot"/>
@@ -599,10 +604,11 @@
         <w:p>
           <w:pPr>
             <w:pStyle w:val="Obsah2"/>
-            <w:ind w:left="216"/>
+            <w:ind w:left="216" w:firstLine="0"/>
+            <w:jc w:val="left"/>
           </w:pPr>
           <w:r>
-            <w:t>1.2 Kolinearita predlaktia a chytu &amp; optimalizácia ťahového vektora</w:t>
+            <w:t>1.2 Kolinearita predlaktia a optimalizácia ťahového vektora</w:t>
           </w:r>
           <w:r>
             <w:ptab w:relativeTo="margin" w:alignment="right" w:leader="dot"/>
@@ -614,10 +620,11 @@
         <w:p>
           <w:pPr>
             <w:pStyle w:val="Obsah2"/>
-            <w:ind w:left="216"/>
+            <w:ind w:left="216" w:firstLine="0"/>
+            <w:jc w:val="left"/>
           </w:pPr>
           <w:r>
-            <w:t>1.3 Periodizačný protokol pre dlhé prsty</w:t>
+            <w:t>1.3 Periodizácia tréningu pre lezcov s dlhými prstami</w:t>
           </w:r>
           <w:r>
             <w:ptab w:relativeTo="margin" w:alignment="right" w:leader="dot"/>
@@ -629,10 +636,11 @@
         <w:p>
           <w:pPr>
             <w:pStyle w:val="Obsah2"/>
-            <w:ind w:left="216"/>
+            <w:ind w:left="216" w:firstLine="0"/>
+            <w:jc w:val="left"/>
           </w:pPr>
           <w:r>
-            <w:t>1.4 Práca nôh ako „brnenie pre pútka“ – tlmenie dynamických rázov</w:t>
+            <w:t>1.4 Práca nôh ako prevencia rázového preťaženia pútok</w:t>
           </w:r>
           <w:r>
             <w:ptab w:relativeTo="margin" w:alignment="right" w:leader="dot"/>
@@ -644,10 +652,11 @@
         <w:p>
           <w:pPr>
             <w:pStyle w:val="Obsah2"/>
-            <w:ind w:left="216"/>
+            <w:ind w:left="216" w:firstLine="0"/>
+            <w:jc w:val="left"/>
           </w:pPr>
           <w:r>
-            <w:t>1.5 Asymetria medzi prstami a ergonomický výber tréningových líšt</w:t>
+            <w:t>1.5 Rozdielna dĺžka prstov a ergonomický výber líšt</w:t>
           </w:r>
           <w:r>
             <w:ptab w:relativeTo="margin" w:alignment="right" w:leader="dot"/>
@@ -659,10 +668,11 @@
         <w:p>
           <w:pPr>
             <w:pStyle w:val="Obsah2"/>
-            <w:ind w:left="216"/>
+            <w:ind w:left="216" w:firstLine="0"/>
+            <w:jc w:val="left"/>
           </w:pPr>
           <w:r>
-            <w:t>1.6 Ochrana kĺbového puzdra a kolaterálnych väzov</w:t>
+            <w:t>1.6 Ochrana kĺbového puzdra pri zošmyknutí ruky z chytu</w:t>
           </w:r>
           <w:r>
             <w:ptab w:relativeTo="margin" w:alignment="right" w:leader="dot"/>
@@ -674,10 +684,11 @@
         <w:p>
           <w:pPr>
             <w:pStyle w:val="Obsah2"/>
-            <w:ind w:left="216"/>
+            <w:ind w:left="216" w:firstLine="0"/>
+            <w:jc w:val="left"/>
           </w:pPr>
           <w:r>
-            <w:t>1.7 Normalizácia hĺbky lišty pri športovom testovaní</w:t>
+            <w:t>1.7 Voľba hĺbky testovacej lišty podľa dĺžky prstov</w:t>
           </w:r>
           <w:r>
             <w:ptab w:relativeTo="margin" w:alignment="right" w:leader="dot"/>
@@ -689,10 +700,11 @@
         <w:p>
           <w:pPr>
             <w:pStyle w:val="Obsah2"/>
-            <w:ind w:left="216"/>
+            <w:ind w:left="216" w:firstLine="0"/>
+            <w:jc w:val="left"/>
           </w:pPr>
           <w:r>
-            <w:t>1.8 Tribológia kože, teplota a manažment trenia</w:t>
+            <w:t>1.8 Tribológia kože, teplota a práca s trením</w:t>
           </w:r>
           <w:r>
             <w:ptab w:relativeTo="margin" w:alignment="right" w:leader="dot"/>
@@ -704,6 +716,8 @@
         <w:p>
           <w:pPr>
             <w:pStyle w:val="Obsah1"/>
+            <w:ind w:left="0" w:firstLine="0"/>
+            <w:jc w:val="left"/>
             <w:rPr>
               <w:b/>
               <w:bCs/>
@@ -714,7 +728,7 @@
               <w:b/>
               <w:bCs/>
             </w:rPr>
-            <w:t>2. Diagnostické sebahodnotenie: Preťažujete svoje pútka a kĺbové puzdrá?</w:t>
+            <w:t>2. Diagnostické sebahodnotenie preťaženia pútok a kĺbov</w:t>
           </w:r>
           <w:r>
             <w:ptab w:relativeTo="margin" w:alignment="right" w:leader="dot"/>
@@ -730,6 +744,8 @@
         <w:p>
           <w:pPr>
             <w:pStyle w:val="Obsah1"/>
+            <w:ind w:left="0" w:firstLine="0"/>
+            <w:jc w:val="left"/>
             <w:rPr>
               <w:b/>
               <w:bCs/>
@@ -740,7 +756,7 @@
               <w:b/>
               <w:bCs/>
             </w:rPr>
-            <w:t>3. Biomechanické usmernenia podľa vekových kategórií: Škálovanie pák článkov prstov a spojivových tkanív počas života</w:t>
+            <w:t>3. Biomechanické odporúčania podľa vekových kategórií</w:t>
           </w:r>
           <w:r>
             <w:ptab w:relativeTo="margin" w:alignment="right" w:leader="dot"/>
@@ -756,10 +772,11 @@
         <w:p>
           <w:pPr>
             <w:pStyle w:val="Obsah2"/>
-            <w:ind w:left="216"/>
+            <w:ind w:left="216" w:firstLine="0"/>
+            <w:jc w:val="left"/>
           </w:pPr>
           <w:r>
-            <w:t>3.0 Princíp celoživotného škálovania pák</w:t>
+            <w:t>3.0 Zmena pákových pomerov počas rastu a vývoja</w:t>
           </w:r>
           <w:r>
             <w:ptab w:relativeTo="margin" w:alignment="right" w:leader="dot"/>
@@ -771,10 +788,11 @@
         <w:p>
           <w:pPr>
             <w:pStyle w:val="Obsah2"/>
-            <w:ind w:left="216"/>
+            <w:ind w:left="216" w:firstLine="0"/>
+            <w:jc w:val="left"/>
           </w:pPr>
           <w:r>
-            <w:t>3.1 Deti (pediatrická kategória: &lt;12–13 rokov / prepubertálne obdobie)</w:t>
+            <w:t>3.1 Deti (do 12–13 rokov / predpubertálne obdobie)</w:t>
           </w:r>
           <w:r>
             <w:ptab w:relativeTo="margin" w:alignment="right" w:leader="dot"/>
@@ -786,10 +804,11 @@
         <w:p>
           <w:pPr>
             <w:pStyle w:val="Obsah2"/>
-            <w:ind w:left="216"/>
+            <w:ind w:left="216" w:firstLine="0"/>
+            <w:jc w:val="left"/>
           </w:pPr>
           <w:r>
-            <w:t>3.2 Juniori a dospievajúci (pubertálna kategória: ~13–18 rokov / rastový špurt)</w:t>
+            <w:t>3.2 Mládež a juniori (13–18 rokov / rastový špurt)</w:t>
           </w:r>
           <w:r>
             <w:ptab w:relativeTo="margin" w:alignment="right" w:leader="dot"/>
@@ -801,10 +820,11 @@
         <w:p>
           <w:pPr>
             <w:pStyle w:val="Obsah2"/>
-            <w:ind w:left="216"/>
+            <w:ind w:left="216" w:firstLine="0"/>
+            <w:jc w:val="left"/>
           </w:pPr>
           <w:r>
-            <w:t>3.3 Dospelí a hlavná kategória (~18–45 rokov / kostrová zrelosť)</w:t>
+            <w:t>3.3 Dospelí lezci (18–45 rokov / kostrová zrelosť)</w:t>
           </w:r>
           <w:r>
             <w:ptab w:relativeTo="margin" w:alignment="right" w:leader="dot"/>
@@ -816,10 +836,11 @@
         <w:p>
           <w:pPr>
             <w:pStyle w:val="Obsah2"/>
-            <w:ind w:left="216"/>
+            <w:ind w:left="216" w:firstLine="0"/>
+            <w:jc w:val="left"/>
           </w:pPr>
           <w:r>
-            <w:t>3.4 Veteráni a masters (starší dospelí: 45–60+ rokov / pomalšia obnova tkanív)</w:t>
+            <w:t>3.4 Starší dospelí a kategória masters (nad 45 rokov)</w:t>
           </w:r>
           <w:r>
             <w:ptab w:relativeTo="margin" w:alignment="right" w:leader="dot"/>
@@ -831,10 +852,11 @@
         <w:p>
           <w:pPr>
             <w:pStyle w:val="Obsah2"/>
-            <w:ind w:left="216"/>
+            <w:ind w:left="216" w:firstLine="0"/>
+            <w:jc w:val="left"/>
           </w:pPr>
           <w:r>
-            <w:t>3.5 Zhrnutie: Celoživotné škálovanie pák článkov prstov a biomechanický rizikový profil</w:t>
+            <w:t>3.5 Prehľad pákových pomerov a rizík podľa veku</w:t>
           </w:r>
           <w:r>
             <w:ptab w:relativeTo="margin" w:alignment="right" w:leader="dot"/>
@@ -846,6 +868,8 @@
         <w:p>
           <w:pPr>
             <w:pStyle w:val="Obsah1"/>
+            <w:ind w:left="0" w:firstLine="0"/>
+            <w:jc w:val="left"/>
             <w:rPr>
               <w:b/>
               <w:bCs/>
@@ -856,7 +880,7 @@
               <w:b/>
               <w:bCs/>
             </w:rPr>
-            <w:t>4. Periodizácia zohľadňujúca fenotyp a návrh mikrocyklov</w:t>
+            <w:t>4. Periodizácia podľa morfotypu prsta a návrh mikrocyklov</w:t>
           </w:r>
           <w:r>
             <w:ptab w:relativeTo="margin" w:alignment="right" w:leader="dot"/>
@@ -872,6 +896,8 @@
         <w:p>
           <w:pPr>
             <w:pStyle w:val="Obsah1"/>
+            <w:ind w:left="0" w:firstLine="0"/>
+            <w:jc w:val="left"/>
             <w:rPr>
               <w:b/>
               <w:bCs/>
@@ -882,7 +908,7 @@
               <w:b/>
               <w:bCs/>
             </w:rPr>
-            <w:t>5. Stručný fyzikálny úvod: Veda v pozadí odporúčaní</w:t>
+            <w:t>5. Stručný fyzikálny prehľad: Teoretické východiská modelu</w:t>
           </w:r>
           <w:r>
             <w:ptab w:relativeTo="margin" w:alignment="right" w:leader="dot"/>
@@ -898,6 +924,8 @@
         <w:p>
           <w:pPr>
             <w:pStyle w:val="Obsah1"/>
+            <w:ind w:left="0" w:firstLine="0"/>
+            <w:jc w:val="left"/>
             <w:rPr>
               <w:b/>
               <w:bCs/>
@@ -908,7 +936,7 @@
               <w:b/>
               <w:bCs/>
             </w:rPr>
-            <w:t>Záver: Dlhovekosť predchádza výkonu</w:t>
+            <w:t>Záver: Dlhodobo udržateľné zdravie ako predpoklad výkonnosti</w:t>
           </w:r>
           <w:r>
             <w:ptab w:relativeTo="margin" w:alignment="right" w:leader="dot"/>
@@ -924,6 +952,8 @@
         <w:p>
           <w:pPr>
             <w:pStyle w:val="Obsah1"/>
+            <w:ind w:left="0" w:firstLine="0"/>
+            <w:jc w:val="left"/>
             <w:rPr>
               <w:b/>
               <w:bCs/>
@@ -1028,7 +1058,7 @@
                 <w:i w:val="0"/>
                 <w:sz w:val="20"/>
               </w:rPr>
-              <w:t>Igor Cerovský (Nezávislý výskumník v oblasti fyziky a biomechaniky lezenia)</w:t>
+              <w:t>Mgr. Igor Cerovský PhD. (Nezávislý výskumník v oblasti fyziky a biomechaniky lezenia)</w:t>
             </w:r>
           </w:p>
         </w:tc>
@@ -1064,7 +1094,7 @@
                 <w:color w:val="333333"/>
                 <w:sz w:val="20"/>
               </w:rPr>
-              <w:t>Dátum publikácie:</w:t>
+              <w:t>Dátum:</w:t>
             </w:r>
           </w:p>
         </w:tc>
@@ -1097,7 +1127,7 @@
                 <w:i w:val="0"/>
                 <w:sz w:val="20"/>
               </w:rPr>
-              <w:t>14. október 2026</w:t>
+              <w:t>21. október 2026</w:t>
             </w:r>
           </w:p>
         </w:tc>
@@ -1202,7 +1232,7 @@
                 <w:color w:val="333333"/>
                 <w:sz w:val="20"/>
               </w:rPr>
-              <w:t>Projektový repozitár:</w:t>
+              <w:t>Repozitár projektu:</w:t>
             </w:r>
           </w:p>
         </w:tc>
@@ -1332,7 +1362,7 @@
           <w:color w:val="1F3864"/>
           <w:sz w:val="30"/>
         </w:rPr>
-        <w:t>Úvod: Spojenie fyziky a lezeckej steny</w:t>
+        <w:t>Úvod: Prepojenie biomechaniky s lezeckou praxou</w:t>
       </w:r>
     </w:p>
     <w:p>
@@ -1348,7 +1378,7 @@
           <w:i w:val="0"/>
           <w:sz w:val="24"/>
         </w:rPr>
-        <w:t>Desaťročia sa tréning prstov v športovom lezení opieral prevažne o empirickú metódu pokus–omyl, často prerušovanú akútnymi ruptúrami pútok (charakteristické počuteľné puknutie – „pop“) a chronickými tendovaginitídami. Hoci sa štandardy na posilňovacích doskách (hangboardoch, ako je bežná 20 mm lišta) a visy s vysokou pridanou záťažou stali všadeprítomnými, často neberú do úvahy základné zákonitosti trojrozmernej muskuloskeletálnej mechaniky.</w:t>
+        <w:t>Metodika tréningu prstov v športovom lezení sa dlhé roky vyvíjala predovšetkým empiricky na základe skúseností lezcov a trénerov. Tento prístup však nezriedka viedol k preťaženiu, akútnym ruptúram pútok alebo chronickým zápalom šliach (tendovaginitídam). Hoci sa štandardizované protokoly na hangboardoch (napr. na 20 mm lište) a visy s pridanou hmotnosťou stali bežnou tréningovou praxou, často nezohľadňujú individuálne rozdiely a priestorovú mechaniku pohybového aparátu.</w:t>
       </w:r>
     </w:p>
     <w:p>
@@ -1364,7 +1394,7 @@
           <w:i w:val="0"/>
           <w:sz w:val="24"/>
         </w:rPr>
-        <w:t>Náš 3D priestorový model naznačuje, že zaťaženie ohýbačov prstov sa zásadne riadi distribúciou kontaktného tlaku, pomerovým škálovaním vonkajších pák a viac-rovinovou vektorovou mechanikou. Táto príručka prevádza komplexné priestorové rovnice do ôsmich praktických biomechanických odporúčaní navrhnutých tak, aby podporovali maximalizáciu športového výkonu pri súčasnom rešpektovaní dlhodobej integrity a zdravia spojivových tkanív.</w:t>
+        <w:t>Výsledky navrhnutého priestorového (3D) modelu ukazujú, že skutočné zaťaženie ohýbačov prstov závisí predovšetkým od rozloženia kontaktného tlaku na chyte, pomeru dĺžky článkov prsta k hĺbke lišty a priestorového smerovania ťahových síl. Cieľom tejto práce je pretaviť tieto biomechanické poznatky do ôsmich praktických odporúčaní, ktoré pomáhajú zvyšovať lezeckú výkonnosť a zároveň chrániť šľachy, pútka a kĺby pred dlhodobým preťažením.</w:t>
       </w:r>
     </w:p>
     <w:p>
@@ -1426,7 +1456,7 @@
                 <w:color w:val="1F4E79"/>
                 <w:sz w:val="22"/>
               </w:rPr>
-              <w:t>Klasifikácia úrovne evidencie (Evidence-Tier):</w:t>
+              <w:t>Klasifikácia úrovne dôkazov:</w:t>
             </w:r>
           </w:p>
           <w:p>
@@ -1439,7 +1469,7 @@
                 <w:rFonts w:ascii="Times New Roman" w:hAnsi="Times New Roman"/>
                 <w:sz w:val="21"/>
               </w:rPr>
-              <w:t>V záujme vedeckej transparentnosti je každé odporúčanie klasifikované podľa primárnej úrovne podkladových dôkazov:</w:t>
+              <w:t>Pre prehľadnosť a odbornú korektnosť je každé odporúčanie označené podľa hlavného zdroja podkladov:</w:t>
             </w:r>
           </w:p>
           <w:p>
@@ -1452,7 +1482,7 @@
                 <w:rFonts w:ascii="Times New Roman" w:hAnsi="Times New Roman"/>
                 <w:sz w:val="21"/>
               </w:rPr>
-              <w:t>• [Odvodené z modelu]: Kvantitatívne výsledky generované priamo naším simulačným výpočtovým aparátom pre 3D muskuloskeletálnu a kontaktnú mechaniku.</w:t>
+              <w:t>• [Odvodené z modelu]: Kvantitatívne výsledky získané priamo z navrhnutého 3D biomechanického modelu prsta a kontaktnej mechaniky.</w:t>
             </w:r>
           </w:p>
           <w:p>
@@ -1465,7 +1495,7 @@
                 <w:rFonts w:ascii="Times New Roman" w:hAnsi="Times New Roman"/>
                 <w:sz w:val="21"/>
               </w:rPr>
-              <w:t>• [Doložené literatúrou]: Zavedené empirické zistenia z klinickej športovej medicíny, kadaveróznych testov alebo tribologickej literatúry.</w:t>
+              <w:t>• [Podložené literatúrou]: Publikované empirické poznatky zo športovej medicíny, kadaveróznych meraní alebo tribológie.</w:t>
             </w:r>
           </w:p>
           <w:p>
@@ -1478,7 +1508,7 @@
                 <w:rFonts w:ascii="Times New Roman" w:hAnsi="Times New Roman"/>
                 <w:sz w:val="21"/>
               </w:rPr>
-              <w:t>• [Mechanistická hypotéza]: Logické dedukcie alebo trénerské heuristiky založené na mechanických princípoch, ktoré si vyžadujú ďalšiu priamu empirickú validáciu.</w:t>
+              <w:t>• [Mechanistická hypotéza]: Odborné predpoklady a trénerské odporúčania vychádzajúce z mechanických princípov, ktoré si vyžadujú ďalšie priame experimentálne overenie.</w:t>
             </w:r>
           </w:p>
         </w:tc>
@@ -1502,7 +1532,7 @@
           <w:color w:val="2F5597"/>
           <w:sz w:val="26"/>
         </w:rPr>
-        <w:t>1.1 Rozpočtovanie úchopového zaťaženia – „Pútka-chrániaci“ otvorený úchop [Odvodené z modelu a doložené literatúrou]</w:t>
+        <w:t>1.1 Dávkovanie úchopov a otvorený úchop ako ochrana pútok [Odvodené z modelu a podložené literatúrou]</w:t>
       </w:r>
     </w:p>
     <w:p>
@@ -1518,16 +1548,16 @@
           <w:i w:val="0"/>
           <w:sz w:val="24"/>
         </w:rPr>
-        <w:t xml:space="preserve">Fyzika úchopu: </w:t>
-      </w:r>
-      <w:r>
-        <w:rPr>
-          <w:rFonts w:ascii="Times New Roman" w:hAnsi="Times New Roman"/>
-          <w:b w:val="0"/>
-          <w:i w:val="0"/>
-          <w:sz w:val="24"/>
-        </w:rPr>
-        <w:t>Pri uzavretom úchope (Full Crimp) núti hyperextenzia v DIP kĺbe šľachu hlbokého ohýbača (FDP) prenášať až 65 % celkového zaťaženia prsta, zatiaľ čo extrémny uhol flexie v PIP kĺbe (105°) smeruje vektor vychýlenia šľachy priamo proti pútku A2. Tým sa normálová sila na pútko A2 zvyšuje na 267,0 N pri štandardnom vise so záťažou 100 N na 10 mm lište (a na 457,5 N pri dynamickom zachytení so záťažou 171,7 N). Naopak, prechod na otvorený úchop (Open Hand) znižuje normálovú silu na pútko A2 na 62,6 N pri vise so záťažou 100 N (a na 107,5 N pri dynamickom zaťažení) – čo predstavuje viac ako 76 % zníženie namáhania pútka (pričom záťaž zostáva stabilne výrazne pod hranicou 100 N v celom rozsahu bežných tréningových záťaží).</w:t>
+        <w:t xml:space="preserve">Biomechanický princíp: </w:t>
+      </w:r>
+      <w:r>
+        <w:rPr>
+          <w:rFonts w:ascii="Times New Roman" w:hAnsi="Times New Roman"/>
+          <w:b w:val="0"/>
+          <w:i w:val="0"/>
+          <w:sz w:val="24"/>
+        </w:rPr>
+        <w:t>Pri zamknutom úchope (full crimp) spôsobuje hyperextenzia v DIP kĺbe to, že šľacha hlbokého ohýbača prstov (FDP) preberá až 65 % celkového zaťaženia, zatiaľ čo výrazné ohnutie v PIP kĺbe (105°) smeruje výslednicu sily šľachy kolmo proti pútku A2. Normálová sila pôsobiaca na pútko A2 tak pri štandardnom vise so záťažou 100 N na 10 mm lište dosahuje 267,0 N (a pri dynamickom zachytení so záťažou 171,7 N narastá až na 457,5 N). Naopak, pri otvorenom úchope (open hand) klesá normálová sila na pútko A2 na 62,6 N pri záťaži 100 N (resp. na 107,5 N pri dynamickom zaťažení), čo predstavuje zníženie namáhania pútka o viac než 76 % (pričom zaťaženie pútka zostáva v celom rozsahu bežných tréningových váh bezpečne pod hranicou 100 N).</w:t>
       </w:r>
     </w:p>
     <w:p>
@@ -1543,7 +1573,7 @@
           <w:i w:val="0"/>
           <w:sz w:val="24"/>
         </w:rPr>
-        <w:t>Praktický tréningový protokol:</w:t>
+        <w:t>Odporúčania pre tréningovú prax:</w:t>
       </w:r>
     </w:p>
     <w:p>
@@ -1568,16 +1598,16 @@
           <w:i w:val="0"/>
           <w:sz w:val="24"/>
         </w:rPr>
-        <w:t xml:space="preserve">Pomer úchopov 80/20: </w:t>
-      </w:r>
-      <w:r>
-        <w:rPr>
-          <w:rFonts w:ascii="Times New Roman" w:hAnsi="Times New Roman"/>
-          <w:b w:val="0"/>
-          <w:i w:val="0"/>
-          <w:sz w:val="24"/>
-        </w:rPr>
-        <w:t>Približne 80 % celkového tréningového objemu (objemové lezenie, vytrvalostné intervaly, základné bloky na hangboarde) sa odporúča smerovať do otvoreného úchopu (Open Hand) a uvoľnenej polovičnej lišty (Half-Crimp).</w:t>
+        <w:t xml:space="preserve">Pravidlo 80 / 20: </w:t>
+      </w:r>
+      <w:r>
+        <w:rPr>
+          <w:rFonts w:ascii="Times New Roman" w:hAnsi="Times New Roman"/>
+          <w:b w:val="0"/>
+          <w:i w:val="0"/>
+          <w:sz w:val="24"/>
+        </w:rPr>
+        <w:t>Približne 80 % celkového tréningového objemu (objemové lezenie, vytrvalostné intervaly, základné visy na hangboarde) sa odporúča absolvovať v otvorenom úchope (open hand) a v polouzamknutom úchope (half-crimp).</w:t>
       </w:r>
     </w:p>
     <w:p>
@@ -1602,16 +1632,16 @@
           <w:i w:val="0"/>
           <w:sz w:val="24"/>
         </w:rPr>
-        <w:t xml:space="preserve">Racionálne dávkovanie uzavretej lišty: </w:t>
-      </w:r>
-      <w:r>
-        <w:rPr>
-          <w:rFonts w:ascii="Times New Roman" w:hAnsi="Times New Roman"/>
-          <w:b w:val="0"/>
-          <w:i w:val="0"/>
-          <w:sz w:val="24"/>
-        </w:rPr>
-        <w:t>Odporúča sa vnímať uzavretý úchop (full crimp so zámkom palca) ako vysoko intenzívnu rezervnú kapacitu. Je vhodné si ho vyhradiť primárne na kľúčové pokusy v projektoch na lištách pod 8 mm, kde ohybový moment v DIP kĺbe nie je možné vyvinúť alternatívnym úchopom. Odporúča sa vyhnúť trénovaniu uzavretých líšt až do úplného svalového vyčerpania.</w:t>
+        <w:t xml:space="preserve">Uvážlivé využívanie zamknutého úchopu: </w:t>
+      </w:r>
+      <w:r>
+        <w:rPr>
+          <w:rFonts w:ascii="Times New Roman" w:hAnsi="Times New Roman"/>
+          <w:b w:val="0"/>
+          <w:i w:val="0"/>
+          <w:sz w:val="24"/>
+        </w:rPr>
+        <w:t>Zamknutý úchop (full crimp so zámkom palca) je vhodné vnímať ako špecifickú silovú rezervu. Odporúča sa vyhradiť ho predovšetkým na ostré pokusy v ťažkých cestách a bouldroch na lištách menších ako 8 mm, kde iný úchop neumožňuje udržať potrebný moment v DIP kĺbe, a nevyužívať ho pri tréningu do úplného svalového zlyhania.</w:t>
       </w:r>
     </w:p>
     <w:p>
@@ -1631,7 +1661,7 @@
           <w:color w:val="2F5597"/>
           <w:sz w:val="26"/>
         </w:rPr>
-        <w:t>1.2 Kolinearita predlaktia a chytu &amp; optimalizácia ťahového vektora – eliminácia priečneho laterálneho strihu [Odvodené z modelu a technická heuristika]</w:t>
+        <w:t>1.2 Kolinearita predlaktia a optimalizácia ťahového vektora [Odvodené z modelu a technická heuristika]</w:t>
       </w:r>
     </w:p>
     <w:p>
@@ -1647,16 +1677,16 @@
           <w:i w:val="0"/>
           <w:sz w:val="24"/>
         </w:rPr>
-        <w:t xml:space="preserve">Fyzika biomechaniky: </w:t>
-      </w:r>
-      <w:r>
-        <w:rPr>
-          <w:rFonts w:ascii="Times New Roman" w:hAnsi="Times New Roman"/>
-          <w:b w:val="0"/>
-          <w:i w:val="0"/>
-          <w:sz w:val="24"/>
-        </w:rPr>
-        <w:t>Anulárne pútka (A2, A4) predstavujú anizotropné väzivovo-chrupavkové oblúky prispôsobené na obvodové napätie (udržiavanie šliach pri kosti). V lokálnom anatomickom súradnicovom systéme proximálneho článku vykazuje stred pútka A2 pri čistej sagitálnej flexii minimálne ohybové zaťaženie mimo roviny (FA2,lat_local ≈ 0 N). Keď sa však MCP kĺb dostane do radiálnej abdukcie mimo sagitálnej roviny (15°), vzniká výrazný priečny presmerovací strih koncentrovaný na pútku A1 / vstupnom palmárnom ústí pútka (137,3 N pri zaťažení 171,7 N; 80,4 N pri zaťažení 100 N). To je sprevádzané 44,4 N mediolaterálneho strihu na kolaterálnych väzoch PIP kĺbu (25,9 N pri 100 N zaťažení) a globálnou laterálnou zložkou 93,0 N (54,5 N pri 100 N zaťažení) odtiahnutia šľachy od kosti (bowstringing) na pútku A2.</w:t>
+        <w:t xml:space="preserve">Biomechanický princíp: </w:t>
+      </w:r>
+      <w:r>
+        <w:rPr>
+          <w:rFonts w:ascii="Times New Roman" w:hAnsi="Times New Roman"/>
+          <w:b w:val="0"/>
+          <w:i w:val="0"/>
+          <w:sz w:val="24"/>
+        </w:rPr>
+        <w:t>Anulárne pútka (A2, A4) predstavujú anizotropné väzivovo-chrupavkové oblúky prispôsobené na obvodové napätie (udržiavanie šliach pri kosti). V lokálnom anatomickom súradnicovom systéme proximálneho článku vykazuje stred pútka A2 pri čistej sagitálnej flexii minimálne ohybové zaťaženie mimo roviny (FA2,lat_local ≈ 0 N). Keď sa však MCP kĺb dostane do radiálnej abdukcie mimo sagitálnej roviny (15°), vzniká výrazný priečny presmerovací strih koncentrovaný na pútku A1 / vstupnom palmárnom ústí pútka (137,3 N pri zaťažení 171,7 N; 80,4 N pri zaťažení 100 N). To je sprevádzané 44,4 N mediolaterálneho strihu na kolaterálnych väzoch PIP kĺbu (25,9 N pri zaťažení 100 N) a globálnou laterálnou zložkou 93,0 N (54,5 N pri zaťažení 100 N) odtiahnutia šľachy od kosti (bowstringing) na pútku A2.</w:t>
       </w:r>
     </w:p>
     <w:p>
@@ -1858,7 +1888,7 @@
           <w:i w:val="0"/>
           <w:sz w:val="24"/>
         </w:rPr>
-        <w:t>Na hangboardoch alebo prenosných lištách sa odporúča polohovať prsty kolmo na hranu, aby sa minimalizovalo krútenie. Namiesto maximalizácie nominálneho čísla na senzore je vhodné uprednostniť čistú sagitálnu mechaniku, tréningovú efektivitu a dlhodobé zdravie kĺbov.</w:t>
+        <w:t>Na hangboardoch alebo prenosných lištách sa odporúča polohovať prsty kolmo na hranu, aby sa minimalizovalo krútenie. Namiesto maximalizácie nominálneho čísla na senzore je vhodné uprednostniť čistú sagitálnu mechaniku, tréningovú efektivitu a dlhodobé zdravie kĺbov. Pri sledovaní progresu je navyše oveľa dôležitejší dlhodobý trend (pri zachovaní rovnakej techniky úchopu) než samotná absolútna nameraná hodnota.</w:t>
       </w:r>
     </w:p>
     <w:p>
@@ -1878,7 +1908,7 @@
           <w:color w:val="2F5597"/>
           <w:sz w:val="26"/>
         </w:rPr>
-        <w:t>1.3 Periodizačný protokol pre dlhé prsty [Odvodené z modelu a periodizačná hypotéza]</w:t>
+        <w:t>1.3 Periodizácia tréningu pre lezcov s dlhými prstami [Odvodené z modelu a periodizačná hypotéza]</w:t>
       </w:r>
     </w:p>
     <w:p>
@@ -1894,16 +1924,16 @@
           <w:i w:val="0"/>
           <w:sz w:val="24"/>
         </w:rPr>
-        <w:t xml:space="preserve">Fyzika pákového pomeru: </w:t>
-      </w:r>
-      <w:r>
-        <w:rPr>
-          <w:rFonts w:ascii="Times New Roman" w:hAnsi="Times New Roman"/>
-          <w:b w:val="0"/>
-          <w:i w:val="0"/>
-          <w:sz w:val="24"/>
-        </w:rPr>
-        <w:t>Pri realistickom sublineárnom alometrickom škálovaní kondylov (ma ∝ L^0,50) majú lezci s dlhými prstami prirodzenú mechanickú nevýhodu páky +17,7 % na mikro-lištách (297,3 N oproti 252,6 N na 6 mm lište). Pri lezení s vlastnou hmotnosťou sa to kombinuje s alometrickým škálovaním telesnej hmotnosti (m ∝ L^2 až L^3), čo zvyšuje zaťaženie pútka A2 na 10 mm lište zo 174,2 N (krátke prsty) na 380,0 N (dlhé prsty) – čo predstavuje +118,1 % nárast zaťaženia, približujúci sa k hraniciam ruptúry zisteným na kadaveróznych vzorkách (~400 N). Navyše, plytké lišty poskytujú dlhým článkom menšie relatívne odľahčenie ohybového momentu (ρ = d / L_DP) a umiestnenie dlhších článkov na malú lištu si vyžaduje ostrejšie uhly flexie v PIP kĺbe (θ_PIP &gt; 100°), čo ďalej zosilňuje odtiahnutie šľachy na pútku A2.</w:t>
+        <w:t xml:space="preserve">Biomechanický princíp: </w:t>
+      </w:r>
+      <w:r>
+        <w:rPr>
+          <w:rFonts w:ascii="Times New Roman" w:hAnsi="Times New Roman"/>
+          <w:b w:val="0"/>
+          <w:i w:val="0"/>
+          <w:sz w:val="24"/>
+        </w:rPr>
+        <w:t>Pri realistickom sublineárnom alometrickom škálovaní kĺbových kondylov (ma ∝ L^0,50) majú lezci s dlhými prstami na mikro-lištách prirodzenú pákovú nevýhodu +17,7 % (297,3 N oproti 252,6 N na 6 mm lište pri rovnakej vonkajšej sile). Pri lezení s vlastnou hmotnosťou sa k tomu pridáva nárast telesnej hmotnosti úmerný výške postavy (m ∝ L^2–L^3), v dôsledku čoho stúpa zaťaženie pútka A2 na 10 mm lište zo 174,2 N (krátke prsty) na 380,0 N (dlhé prsty). Tento nárast o +118,1 % sa už približuje k medznej pevnosti pútka známej z kadaveróznych meraní (~400 N). Plytké lišty navyše poskytujú dlhšiemu koncovému článku menšie relatívne skrátenie páky (ρ = d / L_DP) a poskladanie dlhších článkov na malý chyt si vyžaduje ostrejší uhol v PIP kĺbe (θ_PIP &gt; 100°), čo ešte viac zvyšuje ťah šľachy do pútka A2.</w:t>
       </w:r>
     </w:p>
     <w:p>
@@ -1919,7 +1949,7 @@
           <w:i w:val="0"/>
           <w:sz w:val="24"/>
         </w:rPr>
-        <w:t>Praktický tréningový protokol pre lezcov s dlhými prstami:</w:t>
+        <w:t>Odporúčania pre tréning lezcov s dlhými prstami:</w:t>
       </w:r>
     </w:p>
     <w:p>
@@ -1944,16 +1974,16 @@
           <w:i w:val="0"/>
           <w:sz w:val="24"/>
         </w:rPr>
-        <w:t xml:space="preserve">Progresívna periodizácia spojivových tkanív: </w:t>
-      </w:r>
-      <w:r>
-        <w:rPr>
-          <w:rFonts w:ascii="Times New Roman" w:hAnsi="Times New Roman"/>
-          <w:b w:val="0"/>
-          <w:i w:val="0"/>
-          <w:sz w:val="24"/>
-        </w:rPr>
-        <w:t>Kým kostrové svalstvo sa adaptuje na tréningové podnety v priebehu týždňov, syntéza kolagénu, tvorba priečnych väzieb a prestavba šľachových pútok prebiehajú výrazne pomalším metabolickým tempom (v praxi sa často odhaduje horizont 12 až 24 mesiacov postupného preťažovania). Lezcom s dlhšími prstami sa odporúča postupovať pri zmenšovaní chytov a pridávaní záťaže konzervatívnejšie ako ich rovesníkom s kratšími prstami.</w:t>
+        <w:t xml:space="preserve">Pozvoľnejšia progresia pre spojivové tkanivá: </w:t>
+      </w:r>
+      <w:r>
+        <w:rPr>
+          <w:rFonts w:ascii="Times New Roman" w:hAnsi="Times New Roman"/>
+          <w:b w:val="0"/>
+          <w:i w:val="0"/>
+          <w:sz w:val="24"/>
+        </w:rPr>
+        <w:t>Kým kostrové svaly sa prispôsobujú tréningovému zaťaženiu v priebehu týždňov, prestavba kolagénu a zosilňovanie šľachových pútok prebiehajú výrazne pomalšie (v praxi sa počíta s horizontom 12 až 24 mesiacov postupnej adaptácie). Lezcom s dlhšími prstami sa preto pri prechode na menšie lišty a pri pridávaní závažia odporúča postupovať opatrnejšie než lezcom s kratšími prstami.</w:t>
       </w:r>
     </w:p>
     <w:p>
@@ -1978,16 +2008,16 @@
           <w:i w:val="0"/>
           <w:sz w:val="24"/>
         </w:rPr>
-        <w:t xml:space="preserve">Predĺžené regeneračné okná: </w:t>
-      </w:r>
-      <w:r>
-        <w:rPr>
-          <w:rFonts w:ascii="Times New Roman" w:hAnsi="Times New Roman"/>
-          <w:b w:val="0"/>
-          <w:i w:val="0"/>
-          <w:sz w:val="24"/>
-        </w:rPr>
-        <w:t>Keďže dlhšie prsty zaznamenávajú vyššie absolútne napätie v tkanivách a vyšší tlak na kĺbové puzdrá pri lezení s vlastnou hmotnosťou, poskytnutie 48 až 72 hodín na regeneráciu spojivových tkanív medzi vysoko intenzívnymi tréningami prstov sa javí ako rozumné.</w:t>
+        <w:t xml:space="preserve">Dlhší čas na regeneráciu: </w:t>
+      </w:r>
+      <w:r>
+        <w:rPr>
+          <w:rFonts w:ascii="Times New Roman" w:hAnsi="Times New Roman"/>
+          <w:b w:val="0"/>
+          <w:i w:val="0"/>
+          <w:sz w:val="24"/>
+        </w:rPr>
+        <w:t>Keďže pri lezení s vlastnou hmotnosťou vzniká v dlhších prstoch vyššie absolútne napätie v pútku aj vyšší tlak v kĺboch, medzi vysoko intenzívnymi tréningami prstov sa odporúča ponechať 48 až 72 hodín na regeneráciu spojivových tkanív.</w:t>
       </w:r>
     </w:p>
     <w:p>
@@ -2012,16 +2042,16 @@
           <w:i w:val="0"/>
           <w:sz w:val="24"/>
         </w:rPr>
-        <w:t xml:space="preserve">Využitie biomechanických predností: </w:t>
-      </w:r>
-      <w:r>
-        <w:rPr>
-          <w:rFonts w:ascii="Times New Roman" w:hAnsi="Times New Roman"/>
-          <w:b w:val="0"/>
-          <w:i w:val="0"/>
-          <w:sz w:val="24"/>
-        </w:rPr>
-        <w:t>Športovci s dlhými prstami prirodzene vynikajú na oblinách, veľkých stiskoch, otvorených štruktúrach a technických kompresných bouldroch, kde im rozpätie a plocha trenia poskytujú výraznú mechanickú výhodu. Naopak, na mikro-lištách čelia mechanickej nevýhode; namiesto silenia uzavretých líšt sa odporúča sústrediť na precíznu prácu nôh (vysoké stupy, vyvesenie do nôh, drop-knee) a otvorený ťahový úchop (drag).</w:t>
+        <w:t xml:space="preserve">Využitie morfologických predností: </w:t>
+      </w:r>
+      <w:r>
+        <w:rPr>
+          <w:rFonts w:ascii="Times New Roman" w:hAnsi="Times New Roman"/>
+          <w:b w:val="0"/>
+          <w:i w:val="0"/>
+          <w:sz w:val="24"/>
+        </w:rPr>
+        <w:t>Lezci s dlhými prstami majú prirodzenú výhodu na oblinách, stiskoch, väčších štruktúrach a v kompresných krokoch, kde dokážu využiť väčšiu kontaktnú plochu a obopnutie chytu. Naopak, na mikro-lištách sú v mechanickej nevýhode; namiesto silenia zamknutého úchopu (full crimp) sa im odporúča klásť dôraz na presnú prácu nôh (vysoké stupy, odľahčenie cez boky, drop-knee) a využívanie otvoreného úchopu.</w:t>
       </w:r>
     </w:p>
     <w:p>
@@ -2041,7 +2071,7 @@
           <w:color w:val="2F5597"/>
           <w:sz w:val="26"/>
         </w:rPr>
-        <w:t>1.4 Práca nôh ako „brnenie pre pútka“ – tlmenie dynamických rázových preťažení [Doložené literatúrou a biomechanická extrapolácia]</w:t>
+        <w:t>1.4 Práca nôh ako prevencia rázového preťaženia pútok [Podložené literatúrou a biomechanická extrapolácia]</w:t>
       </w:r>
     </w:p>
     <w:p>
@@ -2057,16 +2087,16 @@
           <w:i w:val="0"/>
           <w:sz w:val="24"/>
         </w:rPr>
-        <w:t xml:space="preserve">Fyzika rázového šoku: </w:t>
-      </w:r>
-      <w:r>
-        <w:rPr>
-          <w:rFonts w:ascii="Times New Roman" w:hAnsi="Times New Roman"/>
-          <w:b w:val="0"/>
-          <w:i w:val="0"/>
-          <w:sz w:val="24"/>
-        </w:rPr>
-        <w:t>V statickej rovnováhe na 10 mm lište zaznamenávajú štandardné prsty silu na pútku A2 v rozsahu 265,1 až 267,0 N pri zaťažení prostredníka 100 N, čo sa nachádza vo fyziologických medziach. Keď sa však noha nečakane pošmykne alebo vyletí zo stupu, vonkajšie zaťaženie okamžite vyskočí na 25–40 % telesnej hmotnosti na jeden prst (171,7 N). Pri tomto zaťažení narastá normálová sila na pútko A2 pri štandardnom fenotype na 457,5 N, čo podstatne prekračuje kadaveróznu referenčnú hodnotu medze pevnosti v ťahu ~400 N (Lin et al. 1990; Schöffl et al. 2009).</w:t>
+        <w:t xml:space="preserve">Biomechanický princíp: </w:t>
+      </w:r>
+      <w:r>
+        <w:rPr>
+          <w:rFonts w:ascii="Times New Roman" w:hAnsi="Times New Roman"/>
+          <w:b w:val="0"/>
+          <w:i w:val="0"/>
+          <w:sz w:val="24"/>
+        </w:rPr>
+        <w:t>V statickej rovnováhe na 10 mm lište pôsobí na pútko A2 pri zaťažení prostredníka silou 100 N sila v rozmedzí 265,1–267,0 N, čo je v rámci fyziologickej tolerancie tkaniva. Ak však noha nečakane skĺzne zo stupu, vonkajšie zaťaženie prsta skokovo narastie na 25–40 % telesnej hmotnosti (171,7 N). Pri takomto ráze stúpne normálová sila na pútko A2 pri štandardnom morfotype na 457,5 N, čo výrazne prekračuje medznú pevnosť pútka zistenú pri kadaveróznych meraniach (~400 N; Lin et al. 1990; Schöffl et al. 2009).</w:t>
       </w:r>
     </w:p>
     <w:p>
@@ -2082,7 +2112,7 @@
           <w:i w:val="0"/>
           <w:sz w:val="24"/>
         </w:rPr>
-        <w:t>Praktické tréningové návyky:</w:t>
+        <w:t>Odporúčania pre tréningovú prax:</w:t>
       </w:r>
     </w:p>
     <w:p>
@@ -2107,16 +2137,16 @@
           <w:i w:val="0"/>
           <w:sz w:val="24"/>
         </w:rPr>
-        <w:t xml:space="preserve">Reflex „pustiť pri šmyku“: </w:t>
-      </w:r>
-      <w:r>
-        <w:rPr>
-          <w:rFonts w:ascii="Times New Roman" w:hAnsi="Times New Roman"/>
-          <w:b w:val="0"/>
-          <w:i w:val="0"/>
-          <w:sz w:val="24"/>
-        </w:rPr>
-        <w:t>Odporúča sa osvojiť si návyk okamžite uvoľniť zovretie ruky a odskočiť, ak sa nohy nečakane pošmyknú, namiesto zúfalého kŕčovitého držania chytu za každú cenu. Akútne ruptúry pútok IV. stupňa sa často vyskytujú práve počas náhleho excentrického rázového zaťaženia po strate stupu.</w:t>
+        <w:t xml:space="preserve">Návyk uvoľniť úchop pri šmyku nohy: </w:t>
+      </w:r>
+      <w:r>
+        <w:rPr>
+          <w:rFonts w:ascii="Times New Roman" w:hAnsi="Times New Roman"/>
+          <w:b w:val="0"/>
+          <w:i w:val="0"/>
+          <w:sz w:val="24"/>
+        </w:rPr>
+        <w:t>Ak nohy nečakane vypadnú zo stupov, odporúča sa chyt radšej vedome pustiť a odskočiť, než sa ho snažiť udržať kŕčovitým stiskom za každú cenu. Akútne ruptúry pútok IV. stupňa vznikajú veľmi často práve pri náhlom excentrickom ráze po šmyku nohy.</w:t>
       </w:r>
     </w:p>
     <w:p>
@@ -2141,16 +2171,16 @@
           <w:i w:val="0"/>
           <w:sz w:val="24"/>
         </w:rPr>
-        <w:t xml:space="preserve">Cvičenia precíznosti nôh: </w:t>
-      </w:r>
-      <w:r>
-        <w:rPr>
-          <w:rFonts w:ascii="Times New Roman" w:hAnsi="Times New Roman"/>
-          <w:b w:val="0"/>
-          <w:i w:val="0"/>
-          <w:sz w:val="24"/>
-        </w:rPr>
-        <w:t>Špičková práca nôh a spevnenie telesného jadra (core) poskytujú funkčnú ochranu flexorových pútok. Nácvik vedomého a presného kladenia nôh na šmykľavé stupy pomáha predchádzať nečakaným pošmyknutiam pri maximálnom zaťažení rúk.</w:t>
+        <w:t xml:space="preserve">Dôraz na presnú prácu nôh a spevnenie trupu: </w:t>
+      </w:r>
+      <w:r>
+        <w:rPr>
+          <w:rFonts w:ascii="Times New Roman" w:hAnsi="Times New Roman"/>
+          <w:b w:val="0"/>
+          <w:i w:val="0"/>
+          <w:sz w:val="24"/>
+        </w:rPr>
+        <w:t>Kvalitná práca nôh a spevnenie stredu tela (core) priamo chránia pútka ohýbačov prstov. Cielený nácvik presného ukladania nôh na vyšmýkané stupy znižuje riziko nečakaného šmyku v momentoch, keď sú prsty maximálne zaťažené.</w:t>
       </w:r>
     </w:p>
     <w:p>
@@ -2175,16 +2205,16 @@
           <w:i w:val="0"/>
           <w:sz w:val="24"/>
         </w:rPr>
-        <w:t xml:space="preserve">Starostlivosť o lezečky a ich čistota: </w:t>
-      </w:r>
-      <w:r>
-        <w:rPr>
-          <w:rFonts w:ascii="Times New Roman" w:hAnsi="Times New Roman"/>
-          <w:b w:val="0"/>
-          <w:i w:val="0"/>
-          <w:sz w:val="24"/>
-        </w:rPr>
-        <w:t>Odporúča sa udržiavať gumu lezečiek čistú. Prach, zvyšky magnézia a nečistoty znižujú koeficient trenia (μ), najmä na ošmýkanom vápenci alebo hladkých no-tex / dual-tex stupoch na umelých stenách. Pravidelné očistenie podrážok lezečiek pred kľúčovým pokusom pomáha zabrániť náhlemu pošmyknutiu nôh, ktoré nárazovo zaťažuje pútka flexorov.</w:t>
+        <w:t xml:space="preserve">Čistota lezečiek: </w:t>
+      </w:r>
+      <w:r>
+        <w:rPr>
+          <w:rFonts w:ascii="Times New Roman" w:hAnsi="Times New Roman"/>
+          <w:b w:val="0"/>
+          <w:i w:val="0"/>
+          <w:sz w:val="24"/>
+        </w:rPr>
+        <w:t>Podrážky lezečiek sa odporúča udržiavať čisté. Prach, nánosy magnézia a nečistoty znižujú koeficient trenia (μ), a to najmä na vyšmýkanom vápenci alebo na hladkých stupoch (no-tex / dual-tex) na umelých stenách. Očistenie lezečiek pred ťažkým pokusom je jednoduchou prevenciou náhleho šmyku nôh a následného rázového preťaženia pútok.</w:t>
       </w:r>
     </w:p>
     <w:p>
@@ -2204,7 +2234,7 @@
           <w:color w:val="2F5597"/>
           <w:sz w:val="26"/>
         </w:rPr>
-        <w:t>1.5 Asymetria medzi prstami a ergonomický výber tréningových líšt [Klinická heuristika doložená literatúrou]</w:t>
+        <w:t>1.5 Rozdielna dĺžka prstov a ergonomický výber líšt [Klinická heuristika podložená literatúrou]</w:t>
       </w:r>
     </w:p>
     <w:p>
@@ -2220,16 +2250,16 @@
           <w:i w:val="0"/>
           <w:sz w:val="24"/>
         </w:rPr>
-        <w:t xml:space="preserve">Fyzika lumbrikálneho strihu: </w:t>
-      </w:r>
-      <w:r>
-        <w:rPr>
-          <w:rFonts w:ascii="Times New Roman" w:hAnsi="Times New Roman"/>
-          <w:b w:val="0"/>
-          <w:i w:val="0"/>
-          <w:sz w:val="24"/>
-        </w:rPr>
-        <w:t>Na rovnej vodorovnej lište je prostredník (III. prst) výrazne dlhší ako ukazovák (II. prst) a prstenník (IV. prst). Aby prsty sedeli v jednej línii na plochej lište, prostredník je nútený do extrémnej hyperflexie v PIP kĺbe (&gt;105°), čo na jeho pútku A2 koncentruje neprimerané normálové sily a krútiace momenty. Navyše, pretože prsty III, IV a V zdieľajú spoločné svalové bruško hlbokého ohýbača (efekt Quadriga), nerovnomerná extenzia prstov vytvára vysoké intertendinózne strihové napätie v lumbrikálnych svaloch.</w:t>
+        <w:t xml:space="preserve">Biomechanický princíp: </w:t>
+      </w:r>
+      <w:r>
+        <w:rPr>
+          <w:rFonts w:ascii="Times New Roman" w:hAnsi="Times New Roman"/>
+          <w:b w:val="0"/>
+          <w:i w:val="0"/>
+          <w:sz w:val="24"/>
+        </w:rPr>
+        <w:t>Prostredník (III. prst) je výrazne dlhší než susedný ukazovák (II. prst) a prstenník (IV. prst). Pri úchope na rovnej vodorovnej lište sa preto končeky prstov prirodzene zrovnávajú do jednej línie, čo núti prostredník do nadmerného zohnutia (hyperflexie &gt;105°) v PIP kĺbe a sústreďuje na jeho pútko A2 neúmerne vysokú normálovú silu a krútiaci moment. Navyše, keďže hlboké ohýbače III., IV. a V. prsta vychádzajú zo spoločného svalového bruška (tzv. efekt quadriga), rozdielne vystretie susedných prstov vyvoláva výrazné strihové napätie medzi šľachami a v oblasti lumbrikálnych svalov.</w:t>
       </w:r>
     </w:p>
     <w:p>
@@ -2245,7 +2275,7 @@
           <w:i w:val="0"/>
           <w:sz w:val="24"/>
         </w:rPr>
-        <w:t>Praktické odporúčania pre vybavenie a tréning:</w:t>
+        <w:t>Odporúčania pre výber pomôcok a tréning:</w:t>
       </w:r>
     </w:p>
     <w:p>
@@ -2270,16 +2300,16 @@
           <w:i w:val="0"/>
           <w:sz w:val="24"/>
         </w:rPr>
-        <w:t xml:space="preserve">Anatomicky tvarované lišty: </w:t>
-      </w:r>
-      <w:r>
-        <w:rPr>
-          <w:rFonts w:ascii="Times New Roman" w:hAnsi="Times New Roman"/>
-          <w:b w:val="0"/>
-          <w:i w:val="0"/>
-          <w:sz w:val="24"/>
-        </w:rPr>
-        <w:t>Odporúča sa voliť posilňovacie dosky s mierne zakrivenými, odstupňovanými alebo zošikmenými lištami, ktoré rešpektujú prirodzený dĺžkový gradient prstov. To umožňuje rovnomernejšie rozloženie záťaže na všetky štyri prsty bez toho, aby bol prostredník nútený do preťažujúcej hyperflexie.</w:t>
+        <w:t xml:space="preserve">Ergonomicky tvarované lišty: </w:t>
+      </w:r>
+      <w:r>
+        <w:rPr>
+          <w:rFonts w:ascii="Times New Roman" w:hAnsi="Times New Roman"/>
+          <w:b w:val="0"/>
+          <w:i w:val="0"/>
+          <w:sz w:val="24"/>
+        </w:rPr>
+        <w:t>Pri tréningu na hangboarde sa odporúča uprednostniť mierne zaoblené, odstupňované alebo skosené lišty, ktoré rešpektujú prirodzený rozdiel v dĺžke prstov. Záťaž sa tak rozloží rovnomernejšie medzi všetky štyri prsty bez toho, aby bol prostredník nútený do extrémneho ohybu v PIP kĺbe.</w:t>
       </w:r>
     </w:p>
     <w:p>
@@ -2304,16 +2334,16 @@
           <w:i w:val="0"/>
           <w:sz w:val="24"/>
         </w:rPr>
-        <w:t xml:space="preserve">Bezpečnosť pri dvojprstových dierach: </w:t>
-      </w:r>
-      <w:r>
-        <w:rPr>
-          <w:rFonts w:ascii="Times New Roman" w:hAnsi="Times New Roman"/>
-          <w:b w:val="0"/>
-          <w:i w:val="0"/>
-          <w:sz w:val="24"/>
-        </w:rPr>
-        <w:t>Pri tréningu dvojprstových úchopov (prostredník–prstenník) sa odporúča vyhnúť sa tesnému zovretiu nepoužitého ukazováka a malíčka do dlane. Udržiavanie voľných prstov v uvoľnenej, mierne pootvorenej polohe pomáha chrániť lumbrikálne svaly pred natrhnutím.</w:t>
+        <w:t xml:space="preserve">Zásady bezpečnosti pri tréningu na dierkach pre dva prsty: </w:t>
+      </w:r>
+      <w:r>
+        <w:rPr>
+          <w:rFonts w:ascii="Times New Roman" w:hAnsi="Times New Roman"/>
+          <w:b w:val="0"/>
+          <w:i w:val="0"/>
+          <w:sz w:val="24"/>
+        </w:rPr>
+        <w:t>Pri zaťažovaní dierok dvojicou prstov (najčastejšie prostredník a prstenník) sa odporúča nekrčiť voľný ukazovák a malíček kŕčovito do dlane. Ak nezaťažené prsty zostanú mierne vystreté a uvoľnené, znižuje sa vzájomný posun šliach hlbokého ohýbača a chránia sa lumbrikálne svaly pred natrhnutím.</w:t>
       </w:r>
     </w:p>
     <w:p>
@@ -2333,7 +2363,7 @@
           <w:color w:val="2F5597"/>
           <w:sz w:val="26"/>
         </w:rPr>
-        <w:t>1.6 Ochrana kĺbového puzdra a kolaterálnych väzov – riziko pošmyknutia s „unikajúcim prostredníkom“ [Klinické pozorovanie a mechanistická hypotéza]</w:t>
+        <w:t>1.6 Ochrana kĺbového puzdra pri zošmyknutí ruky z chytu [Klinické pozorovanie a mechanistická hypotéza]</w:t>
       </w:r>
     </w:p>
     <w:p>
@@ -2349,7 +2379,7 @@
           <w:i w:val="0"/>
           <w:sz w:val="24"/>
         </w:rPr>
-        <w:t>Fyzika postupného zošmykovania prstov:</w:t>
+        <w:t>Mechanizmus postupného zošmykovania prstov:</w:t>
       </w:r>
     </w:p>
     <w:p>
@@ -2374,16 +2404,16 @@
           <w:i w:val="0"/>
           <w:sz w:val="24"/>
         </w:rPr>
-        <w:t xml:space="preserve">Dĺžková disproporcia prstov: </w:t>
-      </w:r>
-      <w:r>
-        <w:rPr>
-          <w:rFonts w:ascii="Times New Roman" w:hAnsi="Times New Roman"/>
-          <w:b w:val="0"/>
-          <w:i w:val="0"/>
-          <w:sz w:val="24"/>
-        </w:rPr>
-        <w:t>V anatómii ľudskej ruky prostredník (III. prst) prečnieva o 8 až 15 mm pred susedný ukazovák (II) a prstenník (IV).</w:t>
+        <w:t xml:space="preserve">Prečnievanie prostredníka: </w:t>
+      </w:r>
+      <w:r>
+        <w:rPr>
+          <w:rFonts w:ascii="Times New Roman" w:hAnsi="Times New Roman"/>
+          <w:b w:val="0"/>
+          <w:i w:val="0"/>
+          <w:sz w:val="24"/>
+        </w:rPr>
+        <w:t>Na ľudskej ruke presahuje prostredník (III. prst) susedný ukazovák (II. prst) a prstenník (IV. prst) zvyčajne o 8 až 15 mm.</w:t>
       </w:r>
     </w:p>
     <w:p>
@@ -2408,16 +2438,16 @@
           <w:i w:val="0"/>
           <w:sz w:val="24"/>
         </w:rPr>
-        <w:t xml:space="preserve">Kaskáda postupného pošmyknutia: </w:t>
-      </w:r>
-      <w:r>
-        <w:rPr>
-          <w:rFonts w:ascii="Times New Roman" w:hAnsi="Times New Roman"/>
-          <w:b w:val="0"/>
-          <w:i w:val="0"/>
-          <w:sz w:val="24"/>
-        </w:rPr>
-        <w:t>Keď sa ruka nečakane začne šmýkať dozadu alebo vyletí z chytu (v dôsledku potu, vyleštenej skaly, mastných dual-tex chytov či prudkého dynamického pohybu), prsty sa neodpájajú synchrónne. Keďže prsty II a IV sú kratšie, skĺznu z hrany ako prvé.</w:t>
+        <w:t xml:space="preserve">Postupná strata kontaktu pri šmyku: </w:t>
+      </w:r>
+      <w:r>
+        <w:rPr>
+          <w:rFonts w:ascii="Times New Roman" w:hAnsi="Times New Roman"/>
+          <w:b w:val="0"/>
+          <w:i w:val="0"/>
+          <w:sz w:val="24"/>
+        </w:rPr>
+        <w:t>Keď sa ruka začne nečakane šmýkať z chytu (vplyvom potu, vyšmýkanej skaly, hladkých dual-tex chytov alebo prudkého dynamického kroku), prsty sa z chytu neuvoľnia súčasne. Kratší ukazovák a prstenník skĺznu z hrany ako prvé.</w:t>
       </w:r>
     </w:p>
     <w:p>
@@ -2442,16 +2472,16 @@
           <w:i w:val="0"/>
           <w:sz w:val="24"/>
         </w:rPr>
-        <w:t xml:space="preserve">Koncentrácia impulzu na jediný prst: </w:t>
-      </w:r>
-      <w:r>
-        <w:rPr>
-          <w:rFonts w:ascii="Times New Roman" w:hAnsi="Times New Roman"/>
-          <w:b w:val="0"/>
-          <w:i w:val="0"/>
-          <w:sz w:val="24"/>
-        </w:rPr>
-        <w:t>Počas kritického intervalu 20–60 milisekúnd pri pošmyknutí sa 100 % hybnosti padajúceho tela a unikajúceho záberu náhle prenesie na jediný prečnievajúci prostredník.</w:t>
+        <w:t xml:space="preserve">Sústredenie celého impulzu na jeden prst: </w:t>
+      </w:r>
+      <w:r>
+        <w:rPr>
+          <w:rFonts w:ascii="Times New Roman" w:hAnsi="Times New Roman"/>
+          <w:b w:val="0"/>
+          <w:i w:val="0"/>
+          <w:sz w:val="24"/>
+        </w:rPr>
+        <w:t>Počas kritických 20–60 milisekúnd pri zošmyknutí sa celá hybnosť padajúceho tela prenesie na jediný prst, ktorý zostal v kontakte s chytom – prečnievajúci prostredník.</w:t>
       </w:r>
     </w:p>
     <w:p>
@@ -2476,16 +2506,16 @@
           <w:i w:val="0"/>
           <w:sz w:val="24"/>
         </w:rPr>
-        <w:t xml:space="preserve">Nútená dynamická excentrická extenzia a torzia: </w:t>
-      </w:r>
-      <w:r>
-        <w:rPr>
-          <w:rFonts w:ascii="Times New Roman" w:hAnsi="Times New Roman"/>
-          <w:b w:val="0"/>
-          <w:i w:val="0"/>
-          <w:sz w:val="24"/>
-        </w:rPr>
-        <w:t>Ako je prostredník ťahaný cez ostrú hranu chytu pod zaťažením plnej hmotnosti tela, podstupuje prudkú, vysokorýchlostnú excentrickú extenziu. Navyše, keďže povrchy chytov a ťahové vektory sú zriedkavo čisto kolmé, unikajúci prst zažíva intenzívny torzný krútiaci moment (M = r × F_slip).</w:t>
+        <w:t xml:space="preserve">Prudké nútené vystretie a krútenie (torzia): </w:t>
+      </w:r>
+      <w:r>
+        <w:rPr>
+          <w:rFonts w:ascii="Times New Roman" w:hAnsi="Times New Roman"/>
+          <w:b w:val="0"/>
+          <w:i w:val="0"/>
+          <w:sz w:val="24"/>
+        </w:rPr>
+        <w:t>Keď sa prostredník pod plnou hmotnosťou tela ťahá cez ostrú hranu chytu, dochádza k jeho prudkému, nútenému vystretiu (excentrickej extenzii). Keďže tvar chytu a smer ťahu sú len málokedy presne kolmé, na prst zároveň pôsobí výrazný krútiaci (torzný) moment (M = r × F_slip).</w:t>
       </w:r>
     </w:p>
     <w:p>
@@ -2510,16 +2540,16 @@
           <w:i w:val="0"/>
           <w:sz w:val="24"/>
         </w:rPr>
-        <w:t xml:space="preserve">Násobenie pákového ramena pri dlhých prstoch: </w:t>
-      </w:r>
-      <w:r>
-        <w:rPr>
-          <w:rFonts w:ascii="Times New Roman" w:hAnsi="Times New Roman"/>
-          <w:b w:val="0"/>
-          <w:i w:val="0"/>
-          <w:sz w:val="24"/>
-        </w:rPr>
-        <w:t>Lezci s dlhými prstami majú podstatne dlhšie páky stredného a distálneho článku (L_MP + L_DP). To priamo znásobuje vonkajší krútiaci moment pôsobiaci na PIP kĺb a vystavuje puzdrové tkanivá závažným špičkovým torzným momentom.</w:t>
+        <w:t xml:space="preserve">Väčšie pákové rameno pri dlhých prstoch: </w:t>
+      </w:r>
+      <w:r>
+        <w:rPr>
+          <w:rFonts w:ascii="Times New Roman" w:hAnsi="Times New Roman"/>
+          <w:b w:val="0"/>
+          <w:i w:val="0"/>
+          <w:sz w:val="24"/>
+        </w:rPr>
+        <w:t>Lezci s dlhými prstami majú podstatne dlhšie páky stredného a koncového článku (L_MP + L_DP), čo priamo znásobuje vonkajší krútiaci moment v PIP kĺbe a vystavuje kĺbové puzdro vysokým špičkovým torzným silám.</w:t>
       </w:r>
     </w:p>
     <w:p>
@@ -2535,7 +2565,7 @@
           <w:i w:val="0"/>
           <w:sz w:val="24"/>
         </w:rPr>
-        <w:t>Patomechanika kĺbového puzdra a palmárnej doštičky:</w:t>
+        <w:t>Mechanizmus poškodenia kĺbového puzdra a palmárnej doštičky:</w:t>
       </w:r>
     </w:p>
     <w:p>
@@ -2560,7 +2590,7 @@
           <w:i w:val="0"/>
           <w:sz w:val="24"/>
         </w:rPr>
-        <w:t>Kým anulárne pútka zlyhávajú primárne pod vplyvom obvodového ťahu smerujúceho dopredu (bowstringing), väzivové puzdro PIP kĺbu, kolaterálne väzy a väzivovo-chrupavková palmárna (volárna) doštička nesú hlavnú záťaž dynamickej hyperextenzie a laterálno-rotačného strihu.</w:t>
+        <w:t>Zatiaľ čo anulárne pútka zlyhávajú najmä pri ťahu šľachy smerom od kosti (bowstringing), väzivové puzdro PIP kĺbu, kolaterálne väzy a väzivovo-chrupavková palmárna (volárna) doštička znášajú hlavný nápor pri násilnom vystretí a bočnom rotačnom strihu.</w:t>
       </w:r>
     </w:p>
     <w:p>
@@ -2585,7 +2615,7 @@
           <w:i w:val="0"/>
           <w:sz w:val="24"/>
         </w:rPr>
-        <w:t>Táto traumatická trakcia spôsobuje mikroskopické trhlinky v úponoch kolaterálnych väzov a preťažuje úpon palmárnej doštičky, čo vedie k akútnej alebo chronickej kapsulitíde / synovitíde PIP kĺbu.</w:t>
+        <w:t>Takéto trhnutie spôsobuje mikrotrhliny v úponoch kolaterálnych väzov a preťažuje úpon palmárnej doštičky, čo vedie k akútnemu alebo chronickému zápalu kĺbového puzdra a výstelky (kapsulitíde / synovitíde PIP kĺbu).</w:t>
       </w:r>
     </w:p>
     <w:p>
@@ -2610,16 +2640,16 @@
           <w:i w:val="0"/>
           <w:sz w:val="24"/>
         </w:rPr>
-        <w:t xml:space="preserve">Klinický obraz: </w:t>
-      </w:r>
-      <w:r>
-        <w:rPr>
-          <w:rFonts w:ascii="Times New Roman" w:hAnsi="Times New Roman"/>
-          <w:b w:val="0"/>
-          <w:i w:val="0"/>
-          <w:sz w:val="24"/>
-        </w:rPr>
-        <w:t>Na rozdiel od akútneho puknutia pútka sa poranenie kĺbového puzdra prejavuje ako hlboká, difúzna obvodová bolesť okolo PIP kĺbu („opuchnutý / hrubý kĺb“), citlivosť pri stlačení kĺbu zbokov, ranná stuhnutosť a ostrá bolesť pri náhodnom bočnom ťuknutí alebo vytočení prsta.</w:t>
+        <w:t xml:space="preserve">Klinické prejavy: </w:t>
+      </w:r>
+      <w:r>
+        <w:rPr>
+          <w:rFonts w:ascii="Times New Roman" w:hAnsi="Times New Roman"/>
+          <w:b w:val="0"/>
+          <w:i w:val="0"/>
+          <w:sz w:val="24"/>
+        </w:rPr>
+        <w:t>Na rozdiel od akútneho prasknutia pútka sa poranenie kĺbového puzdra prejavuje tupou, difúznou bolesťou po celom obvode PIP kĺbu („opuchnutý, zhrubnutý kĺb“), citlivosťou pri stlačení kĺbu zboku, rannou stuhnutosťou a ostrou bolesťou pri náhodnom bočnom buchnutí alebo vytočení prsta.</w:t>
       </w:r>
     </w:p>
     <w:p>
@@ -2635,7 +2665,7 @@
           <w:i w:val="0"/>
           <w:sz w:val="24"/>
         </w:rPr>
-        <w:t>Praktická prevencia a klinický manažment:</w:t>
+        <w:t>Praktická prevencia a režimové opatrenia:</w:t>
       </w:r>
     </w:p>
     <w:p>
@@ -2660,16 +2690,16 @@
           <w:i w:val="0"/>
           <w:sz w:val="24"/>
         </w:rPr>
-        <w:t xml:space="preserve">Odstránenie reflexu „zúfalého záseku“: </w:t>
-      </w:r>
-      <w:r>
-        <w:rPr>
-          <w:rFonts w:ascii="Times New Roman" w:hAnsi="Times New Roman"/>
-          <w:b w:val="0"/>
-          <w:i w:val="0"/>
-          <w:sz w:val="24"/>
-        </w:rPr>
-        <w:t>Trénujte potlačenie reflexu zachytiť pád zúfalým zaťatím jediného unikajúceho prostredníka. Ak sa ruka začne nekontrolovateľne šmýkať, odporúča sa chyt vedome a čisto pustiť, než nechať prostredník ťahať celú hmotnosť tela cez hranu.</w:t>
+        <w:t xml:space="preserve">Potlačenie reflexu kŕčovitého zachytávania šmyku: </w:t>
+      </w:r>
+      <w:r>
+        <w:rPr>
+          <w:rFonts w:ascii="Times New Roman" w:hAnsi="Times New Roman"/>
+          <w:b w:val="0"/>
+          <w:i w:val="0"/>
+          <w:sz w:val="24"/>
+        </w:rPr>
+        <w:t>Odporúča sa vedome trénovať reakciu na pošmyknutie ruky – ak prsty začnú z chytu nekontrolovane schádzať, je bezpečnejšie úchop včas uvoľniť, než nechať celú hmotnosť tela prejsť cez jediný ostávajúci prostredník.</w:t>
       </w:r>
     </w:p>
     <w:p>
@@ -2703,7 +2733,7 @@
           <w:i w:val="0"/>
           <w:sz w:val="24"/>
         </w:rPr>
-        <w:t>Lezcom s výrazným dĺžkovým rozdielom prostredníka alebo opakovaným podráždením kĺbového puzdra sa odporúča aplikovať podporné X-tejpovanie cez palmárnu stranu PIP kĺbu. Prekrížené pásky mechanicky kladú odpor nútenej hyperextenzii a bočnému vychýleniu bez obmedzenia bežnej flexie úchopu.</w:t>
+        <w:t>Lezcom s výrazne dlhším prostredníkom alebo s opakovaným podráždením kĺbového puzdra sa odporúča podporné X-tejpovanie na dlaňovej strane PIP kĺbu. Prekrížené pruhy tejpu mechanicky brzdia násilné vystretie a bočný výkyv kĺbu bez toho, aby obmedzovali bežný ohyb prsta.</w:t>
       </w:r>
     </w:p>
     <w:p>
@@ -2728,16 +2758,41 @@
           <w:i w:val="0"/>
           <w:sz w:val="24"/>
         </w:rPr>
-        <w:t xml:space="preserve">Fixácia susedných prstov („buddy-taping“) pri náročných tréningoch: </w:t>
-      </w:r>
-      <w:r>
-        <w:rPr>
-          <w:rFonts w:ascii="Times New Roman" w:hAnsi="Times New Roman"/>
-          <w:b w:val="0"/>
-          <w:i w:val="0"/>
-          <w:sz w:val="24"/>
-        </w:rPr>
-        <w:t>Pri boulderingu na šmykľavých alebo dynamických oblinách poskytuje voľné zatejpovanie prostredníka k prstenníku (prst III k prstu IV pružnou páskou medzi MCP a PIP kĺbom) kľúčové bočné spevnenie a rozkladá sily pri pošmyknutí na oba prsty.</w:t>
+        <w:t xml:space="preserve">Spojenie susedných prstov (buddy-taping) pri rizikovom lezení: </w:t>
+      </w:r>
+      <w:r>
+        <w:rPr>
+          <w:rFonts w:ascii="Times New Roman" w:hAnsi="Times New Roman"/>
+          <w:b w:val="0"/>
+          <w:i w:val="0"/>
+          <w:sz w:val="24"/>
+        </w:rPr>
+        <w:t>Pri boulderingu na vyšmýkaných alebo dynamických oblinách poskytuje voľné zatejpovanie prostredníka s prstenníkom (III. a IV. prst spojené páskou v oblasti základného a stredného článku) účinnú bočnú oporu a pri prípadnom šmyku rozloží zaťaženie na oba prsty.</w:t>
+      </w:r>
+    </w:p>
+    <w:p>
+      <w:pPr>
+        <w:spacing w:line="324" w:lineRule="auto" w:before="20" w:after="60"/>
+        <w:ind w:left="510" w:hanging="227"/>
+        <w:jc w:val="both"/>
+      </w:pPr>
+      <w:r>
+        <w:rPr>
+          <w:rFonts w:ascii="Times New Roman" w:hAnsi="Times New Roman"/>
+          <w:b/>
+          <w:i w:val="0"/>
+          <w:sz w:val="24"/>
+        </w:rPr>
+        <w:t xml:space="preserve">•  </w:t>
+      </w:r>
+      <w:r>
+        <w:rPr>
+          <w:rFonts w:ascii="Times New Roman" w:hAnsi="Times New Roman"/>
+          <w:b/>
+          <w:i w:val="0"/>
+          <w:sz w:val="24"/>
+        </w:rPr>
+        <w:t>Postup pri podráždení a rehabilitácii synovitídy:</w:t>
       </w:r>
     </w:p>
     <w:p>
@@ -2762,16 +2817,16 @@
           <w:i w:val="0"/>
           <w:sz w:val="24"/>
         </w:rPr>
-        <w:t xml:space="preserve">Vyhnúť sa agresívnemu pasívnemu naťahovaniu: </w:t>
-      </w:r>
-      <w:r>
-        <w:rPr>
-          <w:rFonts w:ascii="Times New Roman" w:hAnsi="Times New Roman"/>
-          <w:b w:val="0"/>
-          <w:i w:val="0"/>
-          <w:sz w:val="24"/>
-        </w:rPr>
-        <w:t>Nútenie opuchnutého kĺbu so zapáleným puzdrom do pasívnej extenzie zhoršuje podráždenie synovie.</w:t>
+        <w:t xml:space="preserve">Vynechanie násilného pasívneho naťahovania: </w:t>
+      </w:r>
+      <w:r>
+        <w:rPr>
+          <w:rFonts w:ascii="Times New Roman" w:hAnsi="Times New Roman"/>
+          <w:b w:val="0"/>
+          <w:i w:val="0"/>
+          <w:sz w:val="24"/>
+        </w:rPr>
+        <w:t>Tlačenie opuchnutého kĺbu so zapáleným puzdrom do pasívneho vystretia či úplného zohnutia zhoršuje dráždenie synoviálnej výstelky.</w:t>
       </w:r>
     </w:p>
     <w:p>
@@ -2796,16 +2851,16 @@
           <w:i w:val="0"/>
           <w:sz w:val="24"/>
         </w:rPr>
-        <w:t xml:space="preserve">Aktívna izometria v strednom rozsahu: </w:t>
-      </w:r>
-      <w:r>
-        <w:rPr>
-          <w:rFonts w:ascii="Times New Roman" w:hAnsi="Times New Roman"/>
-          <w:b w:val="0"/>
-          <w:i w:val="0"/>
-          <w:sz w:val="24"/>
-        </w:rPr>
-        <w:t>Odporúča sa vykonávať jemné, submaximálne izometrické cvičenia v polovičnej lište alebo otvorenom úchope pri flexii 45°–60°, ktoré podporujú cirkuláciu synoviálnej tekutiny a remodeláciu kolagénu.</w:t>
+        <w:t xml:space="preserve">Aktívna izometria v strednom rozsahu ohybu: </w:t>
+      </w:r>
+      <w:r>
+        <w:rPr>
+          <w:rFonts w:ascii="Times New Roman" w:hAnsi="Times New Roman"/>
+          <w:b w:val="0"/>
+          <w:i w:val="0"/>
+          <w:sz w:val="24"/>
+        </w:rPr>
+        <w:t>Vhodné sú mierne, submaximálne izometrické zaťaženia v polouzamknutom úchope (half-crimp) alebo otvorenom úchope pri ohnutí kĺbu o 45°–60°, ktoré podporujú prekrvenie, pohyb kĺbovej tekutiny a prestavbu kolagénu.</w:t>
       </w:r>
     </w:p>
     <w:p>
@@ -2830,16 +2885,16 @@
           <w:i w:val="0"/>
           <w:sz w:val="24"/>
         </w:rPr>
-        <w:t xml:space="preserve">Kontrastná hydroterapia: </w:t>
-      </w:r>
-      <w:r>
-        <w:rPr>
-          <w:rFonts w:ascii="Times New Roman" w:hAnsi="Times New Roman"/>
-          <w:b w:val="0"/>
-          <w:i w:val="0"/>
-          <w:sz w:val="24"/>
-        </w:rPr>
-        <w:t>Striedavé ponáranie do teplej a chladnej vody pomáha redukovať pretrvávajúci pozáťažový kĺbový výpotok a urýchľuje látkovú výmenu v málo cievne zásobenom tkanive kĺbového puzdra.</w:t>
+        <w:t xml:space="preserve">Striedavé kúpele (kontrastná hydroterapia): </w:t>
+      </w:r>
+      <w:r>
+        <w:rPr>
+          <w:rFonts w:ascii="Times New Roman" w:hAnsi="Times New Roman"/>
+          <w:b w:val="0"/>
+          <w:i w:val="0"/>
+          <w:sz w:val="24"/>
+        </w:rPr>
+        <w:t>Striedavé ponáranie ruky do teplej a studenej vody pomáha zmierniť pretrvávajúci opuch kĺbu po záťaži a podporuje látkovú výmenu v málo prekrvenom tkanive kĺbového puzdra.</w:t>
       </w:r>
     </w:p>
     <w:p>
@@ -2859,7 +2914,7 @@
           <w:color w:val="2F5597"/>
           <w:sz w:val="26"/>
         </w:rPr>
-        <w:t>1.7 Normalizácia hĺbky lišty pri športovom testovaní [Hypotéza odvodená z modelu]</w:t>
+        <w:t>1.7 Voľba hĺbky testovacej lišty podľa dĺžky prstov [Hypotéza odvodená z modelu]</w:t>
       </w:r>
     </w:p>
     <w:p>
@@ -2875,16 +2930,16 @@
           <w:i w:val="0"/>
           <w:sz w:val="24"/>
         </w:rPr>
-        <w:t xml:space="preserve">Mýtus univerzálnej 20 mm lišty: </w:t>
-      </w:r>
-      <w:r>
-        <w:rPr>
-          <w:rFonts w:ascii="Times New Roman" w:hAnsi="Times New Roman"/>
-          <w:b w:val="0"/>
-          <w:i w:val="0"/>
-          <w:sz w:val="24"/>
-        </w:rPr>
-        <w:t>Štandardné testovacie protokoly hodnotia všetkých lezcov na jednotnej 20 mm lište. Biomechanicky sa však relatívna hĺbka lišty mení v pomere k dĺžke distálneho článku (d / L_DP):</w:t>
+        <w:t xml:space="preserve">Úskalia jednotnej 20 mm testovacej lišty: </w:t>
+      </w:r>
+      <w:r>
+        <w:rPr>
+          <w:rFonts w:ascii="Times New Roman" w:hAnsi="Times New Roman"/>
+          <w:b w:val="0"/>
+          <w:i w:val="0"/>
+          <w:sz w:val="24"/>
+        </w:rPr>
+        <w:t>Bežné testovacie protokoly hodnotia všetkých lezcov na rovnakej 20 mm lište. Z biomechanického hľadiska sa však skutočná (relatívna) hĺbka chytu mení v závislosti od dĺžky koncového článku prsta (d / L_DP):</w:t>
       </w:r>
     </w:p>
     <w:p>
@@ -2909,7 +2964,7 @@
           <w:i w:val="0"/>
           <w:sz w:val="24"/>
         </w:rPr>
-        <w:t>Pri výrazne krátkoprstom fenotype (spodné percentily, L_DP = 18,7 mm) predstavuje 20 mm hlboký chyt (d / L_DP = 1,07). Zapája sa stredný článok, zaťaženie sa prenáša na pútko A3 a nároky na šľachu FDP dramaticky klesajú.</w:t>
+        <w:t>Pre morfotyp s výrazne krátkymi prstami (spodné percentily populácie, L_DP = 18,7 mm) predstavuje 20 mm lišta hlboký chyt (d / L_DP = 1,07). Do opory o chyt sa zapája aj stredný článok, časť zaťaženia preberá pútko A3 a nároky na šľachu hlbokého ohýbača (FDP) výrazne klesajú.</w:t>
       </w:r>
     </w:p>
     <w:p>
@@ -2934,7 +2989,7 @@
           <w:i w:val="0"/>
           <w:sz w:val="24"/>
         </w:rPr>
-        <w:t>Pri výrazne dlhoprstom fenotype (horné percentily, L_DP = 25,3 mm) predstavuje 20 mm plytkú mikro-lištu (d / L_DP = 0,79), kde sa celé zaťaženie sústredí na koncový článok, čo prudko zvyšuje nároky na ohýbače.</w:t>
+        <w:t>Pre morfotyp s výrazne dlhými prstami (horné percentily populácie, L_DP = 25,3 mm) predstavuje rovnaká 20 mm lišta plytkú lištu (d / L_DP = 0,79), na ktorej celé zaťaženie nesie iba koncový článok, čo podstatne zvyšuje nároky na ohýbače prstov.</w:t>
       </w:r>
     </w:p>
     <w:p>
@@ -2950,7 +3005,7 @@
           <w:i w:val="0"/>
           <w:sz w:val="24"/>
         </w:rPr>
-        <w:t>Praktické odporúčanie pre testovanie:</w:t>
+        <w:t>Praktické odporúčanie pre diagnostiku a testovanie:</w:t>
       </w:r>
     </w:p>
     <w:p>
@@ -2966,7 +3021,7 @@
           <w:i w:val="0"/>
           <w:sz w:val="24"/>
         </w:rPr>
-        <w:t>Odporúča sa štandardizovať testovacie lišty podľa individuálnej anatómie lezca podľa vzorca:</w:t>
+        <w:t>Pri porovnávacom testovaní sa odporúča prispôsobiť hĺbku testovacej lišty anatómii prsta konkrétneho lezca podľa vzťahu:</w:t>
       </w:r>
     </w:p>
     <w:p>
@@ -3007,7 +3062,7 @@
           <w:i w:val="0"/>
           <w:sz w:val="24"/>
         </w:rPr>
-        <w:t>Pre priemerný štandardný prst (L_DP ≈ 22 mm) sa odporúča testovať na lište 17,5 až 18 mm.</w:t>
+        <w:t>Pre štandardne dlhý prst (L_DP ≈ 22 mm) tomu zodpovedá testovacia lišta s hĺbkou 17,5–18 mm.</w:t>
       </w:r>
     </w:p>
     <w:p>
@@ -3032,7 +3087,7 @@
           <w:i w:val="0"/>
           <w:sz w:val="24"/>
         </w:rPr>
-        <w:t>V okrajových prípadoch: pre krátke prsty (18,7 mm) sa rozmer upravuje na 15 mm, kým pre extrémne dlhé prsty (25,3 mm) sa rozmer posúva na 20 až 22 mm.</w:t>
+        <w:t>V krajných prípadoch morfotypu vychádza pre krátke prsty (18,7 mm) ekvivalentná hĺbka 15 mm, zatiaľ čo pre dlhé prsty (25,3 mm) hĺbka 20–22 mm.</w:t>
       </w:r>
     </w:p>
     <w:p>
@@ -3052,7 +3107,7 @@
           <w:color w:val="2F5597"/>
           <w:sz w:val="26"/>
         </w:rPr>
-        <w:t>1.8 Tribológia kože, teplota a manažment trenia [Doložené literatúrou a tribologická heuristika]</w:t>
+        <w:t>1.8 Tribológia kože, teplota a práca s trením [Podložené literatúrou a tribologická heuristika]</w:t>
       </w:r>
     </w:p>
     <w:p>
@@ -3068,16 +3123,16 @@
           <w:i w:val="0"/>
           <w:sz w:val="24"/>
         </w:rPr>
-        <w:t xml:space="preserve">Fyzika trenia a tribológia: </w:t>
-      </w:r>
-      <w:r>
-        <w:rPr>
-          <w:rFonts w:ascii="Times New Roman" w:hAnsi="Times New Roman"/>
-          <w:b w:val="0"/>
-          <w:i w:val="0"/>
-          <w:sz w:val="24"/>
-        </w:rPr>
-        <w:t>Trenie medzi pokožkou a skalou má nelineárny charakter a pri vysokom zaťažení klesá (μ ∝ F_N^(n-1)). Epidermálna vrstva kože sa správa ako viskoelastický kompozit; trenie sleduje krivku tvaru obráteného U v závislosti od teploty a hydratácie stratum corneum:</w:t>
+        <w:t xml:space="preserve">Biomechanický princíp: </w:t>
+      </w:r>
+      <w:r>
+        <w:rPr>
+          <w:rFonts w:ascii="Times New Roman" w:hAnsi="Times New Roman"/>
+          <w:b w:val="0"/>
+          <w:i w:val="0"/>
+          <w:sz w:val="24"/>
+        </w:rPr>
+        <w:t>Trenie medzi kožou bruška prsta a povrchom skaly či chytu má nelineárny charakter a pri vysokom kontaktnom tlaku relatívne klesá (μ ∝ F_N^(n-1)). Rohová vrstva pokožky (stratum corneum) sa správa ako viskoelastický materiál, pričom koeficient trenia v závislosti od teploty a vlhkosti kože opisuje krivku v tvare obráteného písmena U:</w:t>
       </w:r>
     </w:p>
     <w:p>
@@ -3102,16 +3157,16 @@
           <w:i w:val="0"/>
           <w:sz w:val="24"/>
         </w:rPr>
-        <w:t xml:space="preserve">Teplý a spotený režim („uvarenie chytu / greasing out“): </w:t>
-      </w:r>
-      <w:r>
-        <w:rPr>
-          <w:rFonts w:ascii="Times New Roman" w:hAnsi="Times New Roman"/>
-          <w:b w:val="0"/>
-          <w:i w:val="0"/>
-          <w:sz w:val="24"/>
-        </w:rPr>
-        <w:t>Keď teplota okolia stúpne (&gt;20 °C) alebo sa ruky potia, vytvára sa tekutý mazací film, ktorý spôsobuje prepad koeficientu trenia μ z ≈ 0,65 pod hodnotu 0,35. Ako kompenzáciu lezec prirodzene stláča chyt vyššou normálovou silou, čo kaskádovito vedie k vysokému napätiu v šľachách.</w:t>
+        <w:t xml:space="preserve">Vysoká teplota a vlhkosť („šmýkanie na pote“, angl. greasing out): </w:t>
+      </w:r>
+      <w:r>
+        <w:rPr>
+          <w:rFonts w:ascii="Times New Roman" w:hAnsi="Times New Roman"/>
+          <w:b w:val="0"/>
+          <w:i w:val="0"/>
+          <w:sz w:val="24"/>
+        </w:rPr>
+        <w:t>Pri vyššej teplote okolia (&gt;20 °C) alebo nadmernom potení prstov vzniká na povrchu kože tenký tekutý film, ktorý znižuje koeficient trenia μ z hodnôt okolo 0,65 pod 0,35. Lezec tento pokles trenia podvedome kompenzuje silnejším stiskom chytu (vyššou normálovou silou), čo priamo zvyšuje ťah v šľachách a zaťaženie pútok.</w:t>
       </w:r>
     </w:p>
     <w:p>
@@ -3136,16 +3191,16 @@
           <w:i w:val="0"/>
           <w:sz w:val="24"/>
         </w:rPr>
-        <w:t xml:space="preserve">Extrémne chladný a vysušený režim („vyšmyknutie na sucho / dry-firing“): </w:t>
-      </w:r>
-      <w:r>
-        <w:rPr>
-          <w:rFonts w:ascii="Times New Roman" w:hAnsi="Times New Roman"/>
-          <w:b w:val="0"/>
-          <w:i w:val="0"/>
-          <w:sz w:val="24"/>
-        </w:rPr>
-        <w:t>Naopak, extrémny chlad (&lt;5 °C), veľmi nízka vlhkosť vzduchu (&lt;30 % RH) alebo nadmerne premagneziovaná pokožka vyvolávajú opačný, rovnako nebezpečný jav známy v lezeckom slangu ako „dry-firing“. V mrazivom a suchom vzduchu stráca stratum corneum svoju viskoelastickú prispôsobivosť a mení sa na tvrdý, sklovitý povrch. Bez základnej vnútornej vlhkosti sa koža nedokáže mikroskopicky deformovať do nerovností skaly. Končeky prstov sa z chytu okamžite zošmyknú bez akéhokoľvek hmatového varovania, čo vysiela netlmené dynamické rázové vlny priamo do anulárnych pútok a kĺbových puzdier.</w:t>
+        <w:t xml:space="preserve">Nízka teplota a presušená koža („ustrelenie na sucho“, angl. dry-firing): </w:t>
+      </w:r>
+      <w:r>
+        <w:rPr>
+          <w:rFonts w:ascii="Times New Roman" w:hAnsi="Times New Roman"/>
+          <w:b w:val="0"/>
+          <w:i w:val="0"/>
+          <w:sz w:val="24"/>
+        </w:rPr>
+        <w:t>Naopak, silný chlad (&lt;5 °C), nízka vlhkosť vzduchu (&lt;30 % RH) alebo nadmerné vrstvenie magnézia spôsobujú opačný, rovnako rizikový jav označovaný ako dry-firing. V chladnom a suchom prostredí stráca povrchová vrstva kože svoju pružnosť a stáva sa tvrdou a krehkou. Bez prirodzenej vlhkosti sa pokožka nedokáže mikroskopicky prispôsobiť nerovnostiam chytu, prsty z neho bez varovania „ustrelia“ a náhle odľahčenie či zachytenie šmyku prenesie prudký ráz do pútok a kĺbových puzdier.</w:t>
       </w:r>
     </w:p>
     <w:p>
@@ -3161,7 +3216,7 @@
           <w:i w:val="0"/>
           <w:sz w:val="24"/>
         </w:rPr>
-        <w:t>Praktický protokol starostlivosti o kožu:</w:t>
+        <w:t>Praktické odporúčania pre starostlivosť o kožu a prácu s trením:</w:t>
       </w:r>
     </w:p>
     <w:p>
@@ -3186,16 +3241,16 @@
           <w:i w:val="0"/>
           <w:sz w:val="24"/>
         </w:rPr>
-        <w:t xml:space="preserve">Optimálna zóna trenia: </w:t>
-      </w:r>
-      <w:r>
-        <w:rPr>
-          <w:rFonts w:ascii="Times New Roman" w:hAnsi="Times New Roman"/>
-          <w:b w:val="0"/>
-          <w:i w:val="0"/>
-          <w:sz w:val="24"/>
-        </w:rPr>
-        <w:t>Najvhodnejšie podmienky pre trenie nastávajú v chladnom, sviežom prostredí (≈ 8–15 °C s miernou relatívnou vlhkosťou 40–60 %), kedy je pokožka dostatočne tuhá, aby odolávala strihu, no zároveň dostatočne poddajná na mikroskopické uzamknutie v štruktúre materiálu.</w:t>
+        <w:t xml:space="preserve">Optimálne podmienky pre trenie: </w:t>
+      </w:r>
+      <w:r>
+        <w:rPr>
+          <w:rFonts w:ascii="Times New Roman" w:hAnsi="Times New Roman"/>
+          <w:b w:val="0"/>
+          <w:i w:val="0"/>
+          <w:sz w:val="24"/>
+        </w:rPr>
+        <w:t>Najlepšie trenie pokožka dosahuje v chladnejšom prostredí (≈ 8–15 °C pri relatívnej vlhkosti vzduchu 40–60 %), keď je dostatočne pevná v strihu, no zároveň si zachováva pružnosť potrebnú na kopírovanie mikroštruktúry skaly.</w:t>
       </w:r>
     </w:p>
     <w:p>
@@ -3220,16 +3275,16 @@
           <w:i w:val="0"/>
           <w:sz w:val="24"/>
         </w:rPr>
-        <w:t xml:space="preserve">Prevencia vyšmyknutia na sucho: </w:t>
-      </w:r>
-      <w:r>
-        <w:rPr>
-          <w:rFonts w:ascii="Times New Roman" w:hAnsi="Times New Roman"/>
-          <w:b w:val="0"/>
-          <w:i w:val="0"/>
-          <w:sz w:val="24"/>
-        </w:rPr>
-        <w:t>Počas mrazivých suchých dní sa odporúča vyhnúť sa nadmernému nabaľovaniu magnézia na už vysušené ruky. Prsty je vhodné zohriať vo vreckách, prípadne pred nástupom na končeky prstov jemne dýchnuť teplý vlhký dych. Toto minimálne množstvo vlhkosti obnoví elasticitu pokožky bez vyvolania tekutého potu.</w:t>
+        <w:t xml:space="preserve">Prevencia „ustrelenia na sucho“ (dry-firing): </w:t>
+      </w:r>
+      <w:r>
+        <w:rPr>
+          <w:rFonts w:ascii="Times New Roman" w:hAnsi="Times New Roman"/>
+          <w:b w:val="0"/>
+          <w:i w:val="0"/>
+          <w:sz w:val="24"/>
+        </w:rPr>
+        <w:t>V chladnom a suchom počasí sa odporúča nepreháňať množstvo magnézia na už vysušených prstoch. Pred pokusom je vhodné zohriať prsty vo vreckách a v prípade príliš suchej kože na brušká prstov jemne dýchnuť – minimálna vlhkosť z dychu vráti koži poddajnosť bez toho, aby sa prsty spotili.</w:t>
       </w:r>
     </w:p>
     <w:p>
@@ -3254,16 +3309,16 @@
           <w:i w:val="0"/>
           <w:sz w:val="24"/>
         </w:rPr>
-        <w:t xml:space="preserve">Hygiena čistenia chytov a magnézium: </w:t>
-      </w:r>
-      <w:r>
-        <w:rPr>
-          <w:rFonts w:ascii="Times New Roman" w:hAnsi="Times New Roman"/>
-          <w:b w:val="0"/>
-          <w:i w:val="0"/>
-          <w:sz w:val="24"/>
-        </w:rPr>
-        <w:t>Pravidelné čistenie chytov kefkou odstraňuje vrstvy vylešteného nánosu a usadeného magnézia a obnovuje mikroštruktúru povrchu. Vhodná kombinácia tekutého kriedového základu s čistým uhličitanom horečnatým udržiava ruky suché bez toho, aby tkanivo vysušila do sklovitého, krehkého stavu.</w:t>
+        <w:t xml:space="preserve">Čistenie chytov a používanie magnézia: </w:t>
+      </w:r>
+      <w:r>
+        <w:rPr>
+          <w:rFonts w:ascii="Times New Roman" w:hAnsi="Times New Roman"/>
+          <w:b w:val="0"/>
+          <w:i w:val="0"/>
+          <w:sz w:val="24"/>
+        </w:rPr>
+        <w:t>Pravidelné čistenie chytov kefkou odstraňuje nánosy mastnoty, gumy a udupaného magnézia a obnovuje drsnosť povrchu. Vhodná kombinácia tekutého magnézia ako základnej vrstvy a primeraného množstva sypkého magnézia (uhličitanu horečnatého) udrží prsty suché bez nadmerného presušenia pokožky.</w:t>
       </w:r>
     </w:p>
     <w:p>
@@ -3283,7 +3338,7 @@
           <w:color w:val="1F3864"/>
           <w:sz w:val="30"/>
         </w:rPr>
-        <w:t>2. Diagnostické sebahodnotenie: Preťažujete svoje pútka a kĺbové puzdrá?</w:t>
+        <w:t>2. Diagnostické sebahodnotenie preťaženia pútok a kĺbov</w:t>
       </w:r>
     </w:p>
     <w:p>
@@ -3299,7 +3354,7 @@
           <w:i w:val="0"/>
           <w:sz w:val="24"/>
         </w:rPr>
-        <w:t>Tento klinický kontrolný zoznam založený na dôkazoch slúži lezcom a trénerom na identifikáciu mikropoškodení ešte pred vznikom akútneho štrukturálneho zlyhania tkanív:</w:t>
+        <w:t>Nasledujúci prehľad slúži na včasné rozpoznanie varovných príznakov mikrotraumatizácie tkanív ešte pred vznikom vážneho akútneho zranenia:</w:t>
       </w:r>
     </w:p>
     <w:p>
@@ -3367,7 +3422,7 @@
                 <w:color w:val="1F3864"/>
                 <w:sz w:val="20"/>
               </w:rPr>
-              <w:t>Diagnostický príznak</w:t>
+              <w:t>Varovný príznak</w:t>
             </w:r>
           </w:p>
         </w:tc>
@@ -3396,7 +3451,7 @@
                 <w:color w:val="1F3864"/>
                 <w:sz w:val="20"/>
               </w:rPr>
-              <w:t>Anatomická štruktúra</w:t>
+              <w:t>Postihnutá štruktúra</w:t>
             </w:r>
           </w:p>
         </w:tc>
@@ -3487,7 +3542,7 @@
                 <w:i w:val="0"/>
                 <w:sz w:val="19"/>
               </w:rPr>
-              <w:t>Ranná stuhnutosť pri báze proximálneho článku</w:t>
+              <w:t>Ranná stuhnutosť na dlaňovej strane základného článku</w:t>
             </w:r>
           </w:p>
         </w:tc>
@@ -3515,7 +3570,7 @@
                 <w:i w:val="0"/>
                 <w:sz w:val="19"/>
               </w:rPr>
-              <w:t>Pošva pútka A2</w:t>
+              <w:t>Pútko A2 a šľachová pošva</w:t>
             </w:r>
           </w:p>
         </w:tc>
@@ -3543,7 +3598,7 @@
                 <w:i w:val="0"/>
                 <w:sz w:val="19"/>
               </w:rPr>
-              <w:t>Opakované vysoké obvodové napätie pri chronickom lištovaní</w:t>
+              <w:t>Opakované vysoké obvodové napätie pri častom lezení po lištách</w:t>
             </w:r>
           </w:p>
         </w:tc>
@@ -3571,7 +3626,7 @@
                 <w:i w:val="0"/>
                 <w:sz w:val="19"/>
               </w:rPr>
-              <w:t>Znížiť objem lištovania o 50 %; na 10 dní prejsť na otvorený úchop.</w:t>
+              <w:t>Znížiť objem lezenia na malých lištách o 50 %; na 10 dní prejsť na otvorený úchop.</w:t>
             </w:r>
           </w:p>
         </w:tc>
@@ -3604,7 +3659,7 @@
                 <w:i w:val="0"/>
                 <w:sz w:val="19"/>
               </w:rPr>
-              <w:t>Ostrá bolesť pri tlaku na palmárnu bázu PIP kĺbu</w:t>
+              <w:t>Ostrá bolesť pri tlaku na dlaňovú stranu PIP kĺbu</w:t>
             </w:r>
           </w:p>
         </w:tc>
@@ -3632,7 +3687,7 @@
                 <w:i w:val="0"/>
                 <w:sz w:val="19"/>
               </w:rPr>
-              <w:t>Distálne A2 / proximálne A3</w:t>
+              <w:t>Distálny okraj pútka A2 / pútko A3</w:t>
             </w:r>
           </w:p>
         </w:tc>
@@ -3660,7 +3715,7 @@
                 <w:i w:val="0"/>
                 <w:sz w:val="19"/>
               </w:rPr>
-              <w:t>Odtrhové napätie (peel stress) z hyperextenzie v DIP kĺbe pri uzavretom úchope</w:t>
+              <w:t>Odťahovanie pútka od kosti pri hyperextenzii v DIP kĺbe v zamknutom úchope (full crimp)</w:t>
             </w:r>
           </w:p>
         </w:tc>
@@ -3688,7 +3743,7 @@
                 <w:i w:val="0"/>
                 <w:sz w:val="19"/>
               </w:rPr>
-              <w:t>Odporúča sa okamžite prerušiť uzavretý úchop; podpora H-tejpovaním alebo termoplastickým prstencom.</w:t>
+              <w:t>Okamžite vynechať zamknutý úchop; odľahčiť pútko H-tejpovaním alebo podporným prstencom.</w:t>
             </w:r>
           </w:p>
         </w:tc>
@@ -3721,7 +3776,7 @@
                 <w:i w:val="0"/>
                 <w:sz w:val="19"/>
               </w:rPr>
-              <w:t>Bolesť pri ťahu na bočných chytoch / gastonoch</w:t>
+              <w:t>Bolesť pri ťahu za bočné chyty a gastony</w:t>
             </w:r>
           </w:p>
         </w:tc>
@@ -3777,7 +3832,7 @@
                 <w:i w:val="0"/>
                 <w:sz w:val="19"/>
               </w:rPr>
-              <w:t>Nadmerný strih pri radiálnej abdukcii v MCP kĺbe (FA1,lat &gt; 80 N, FPIP,ML &gt; 40 N)</w:t>
+              <w:t>Nadmerný bočný strih pri odklone prsta v MCP kĺbe (FA1,lat &gt; 80 N, FPIP,ML &gt; 40 N)</w:t>
             </w:r>
           </w:p>
         </w:tc>
@@ -3805,7 +3860,7 @@
                 <w:i w:val="0"/>
                 <w:sz w:val="19"/>
               </w:rPr>
-              <w:t>Skontrolovať líniu predlaktia; vyhnúť sa vytáčaniu ruky na chyte.</w:t>
+              <w:t>Upraviť polohu lakťa a predlaktia; nevytáčať zápästie a prsty na chyte do strán.</w:t>
             </w:r>
           </w:p>
         </w:tc>
@@ -3838,7 +3893,7 @@
                 <w:i w:val="0"/>
                 <w:sz w:val="19"/>
               </w:rPr>
-              <w:t>Bolesť medzi prstenníkom a prostredníkom</w:t>
+              <w:t>Bolesť v dlani medzi prostredníkom a prstenníkom</w:t>
             </w:r>
           </w:p>
         </w:tc>
@@ -3866,7 +3921,7 @@
                 <w:i w:val="0"/>
                 <w:sz w:val="19"/>
               </w:rPr>
-              <w:t>Strih v lumbrikálnom svale</w:t>
+              <w:t>Lumbrikálny sval</w:t>
             </w:r>
           </w:p>
         </w:tc>
@@ -3894,7 +3949,7 @@
                 <w:i w:val="0"/>
                 <w:sz w:val="19"/>
               </w:rPr>
-              <w:t>Efekt Quadriga pri zaťažení hlbokých dier so zovretými voľnými prstami v dlani</w:t>
+              <w:t>Efekt quadriga pri zaťažení dierok so zovretými voľnými prstami v dlani</w:t>
             </w:r>
           </w:p>
         </w:tc>
@@ -3922,7 +3977,7 @@
                 <w:i w:val="0"/>
                 <w:sz w:val="19"/>
               </w:rPr>
-              <w:t>Odporúča sa prerušiť tréning 2-prstových dier; trénovať výhradne štvorprstový otvorený úchop.</w:t>
+              <w:t>Prerušiť tréning na dvojprstových dierkach; trénovať len so všetkými štyrmi prstami v otvorenom úchope.</w:t>
             </w:r>
           </w:p>
         </w:tc>
@@ -3955,7 +4010,7 @@
                 <w:i w:val="0"/>
                 <w:sz w:val="19"/>
               </w:rPr>
-              <w:t>Hlboká obvodová bolesť PIP kĺbu; bočná citlivosť po pošmyknutí ruky</w:t>
+              <w:t>Tupá bolesť po obvode PIP kĺbu a citlivosť zboku po šmyku ruky</w:t>
             </w:r>
           </w:p>
         </w:tc>
@@ -4011,7 +4066,7 @@
                 <w:i w:val="0"/>
                 <w:sz w:val="19"/>
               </w:rPr>
-              <w:t>Postupné zošmykovanie prstov pri dynamickom pošmyknutí; dlhý prostredník absorbuje 100 % hybnosti pádu pri prudkej excentrickej extenzii a torznom strihu.</w:t>
+              <w:t>Postupné zošmyknutie prstov z chytu, pri ktorom dlhší prostredník zachytil celú hybnosť pádu v prudkom vystretí a skrútení.</w:t>
             </w:r>
           </w:p>
         </w:tc>
@@ -4039,7 +4094,7 @@
                 <w:i w:val="0"/>
                 <w:sz w:val="19"/>
               </w:rPr>
-              <w:t>Zastaviť reflex zúfalého držania pri šmyku; aplikovať X-tejpovanie PIP kĺbu alebo fixáciu k susednému prstu (prsty III+IV); aktívna izometria v strednom rozsahu; vyhnúť sa pasívnej hyperextenzii kĺbu, kým synovitída neustúpi.</w:t>
+              <w:t>Nekŕčovať ruku pri šmyku; použiť X-tejpovanie PIP kĺbu alebo spojenie III. a IV. prsta (buddy-taping); zaradiť jemnú izometriu v strednom ohybe a vyhnúť sa pasívnemu naťahovaniu do ústupu opuchu.</w:t>
             </w:r>
           </w:p>
         </w:tc>
@@ -4063,7 +4118,7 @@
           <w:color w:val="1F3864"/>
           <w:sz w:val="30"/>
         </w:rPr>
-        <w:t>3. Biomechanické usmernenia podľa vekových kategórií: Škálovanie pák článkov prstov a spojivových tkanív počas života</w:t>
+        <w:t>3. Biomechanické odporúčania podľa vekových kategórií</w:t>
       </w:r>
     </w:p>
     <w:p>
@@ -4083,7 +4138,7 @@
           <w:color w:val="2F5597"/>
           <w:sz w:val="26"/>
         </w:rPr>
-        <w:t>3.0 Princíp celoživotného škálovania pák</w:t>
+        <w:t>3.0 Zmena pákových pomerov počas rastu a vývoja</w:t>
       </w:r>
     </w:p>
     <w:p>
@@ -4099,7 +4154,7 @@
           <w:i w:val="0"/>
           <w:sz w:val="24"/>
         </w:rPr>
-        <w:t>Náš 3D biomechanický model poukazuje na to, že vnútorné napätie v šľachách ohýbačov (T_FDP, T_FDS), kĺbové reakčné sily (F_joint) a normálové zaťaženia anulárnych pútok (F_A2, F_A4) sú diktované momentovou rovnováhou okolo jednotlivých kĺbov prsta:</w:t>
+        <w:t>Navrhnutý 3D biomechanický model ukazuje, že vnútorné napätie v šľachách ohýbačov (T_FDP, T_FDS), reakčné sily v kĺboch (F_joint) a normálové sily pôsobiace na anulárne pútka (F_A2, F_A4) sú určené momentovou rovnováhou v jednotlivých kĺboch prsta:</w:t>
       </w:r>
     </w:p>
     <w:p>
@@ -4147,7 +4202,7 @@
           <w:i w:val="0"/>
           <w:sz w:val="24"/>
         </w:rPr>
-        <w:t>Pretože vnútorné pákové rameno šľachy v osteofibróznom digitálnom kanáli rastie sublineárne s kalibrom skeletu (ma ∝ L^0,50), vnútorné napätie šliach a normálové sily na pútka rastú priamo s dĺžkou pák článkov prstov (L_DP, L_MP, L_PP).</w:t>
+        <w:t>Keďže vnútorné rameno sily šľachy v osteofibróznom kanáli prsta rastie s hrúbkou kostry len sublineárne (ma ∝ L^0,50), ťah v šľachách a normálové zaťaženie pútok priamo narastajú s predlžovaním článkov prsta (L_DP, L_MP, L_PP).</w:t>
       </w:r>
     </w:p>
     <w:p>
@@ -4163,7 +4218,7 @@
           <w:i w:val="0"/>
           <w:sz w:val="24"/>
         </w:rPr>
-        <w:t>Okrem toho redistribúcia kontaktu pozdĺž prsta závisí od bezrozmerného pomeru hĺbky chytu:</w:t>
+        <w:t>Rozloženie tlaku pozdĺž prsta zároveň závisí od bezrozmerného pomeru hĺbky chytu k dĺžke koncového článku:</w:t>
       </w:r>
     </w:p>
     <w:p>
@@ -4195,7 +4250,7 @@
           <w:i w:val="0"/>
           <w:sz w:val="24"/>
         </w:rPr>
-        <w:t>Keď je ρ ≤ 1,0, kontaktná sila je koncentrovaná ako jednočlánkový kontakt výlučne na distálnom článku. Keď je ρ &gt; 1,0, stredný článok vytvára dvojčlánkový kontakt, čím prenáša časť normálovej sily na stredný článok, stabilizuje pútko A3 a znižuje vonkajší ohybový moment v DIP kĺbe k nule.</w:t>
+        <w:t>Ak je ρ ≤ 1,0, zaťaženie nesie výlučne koncový článok (jednočlánkový kontakt). Ak je ρ &gt; 1,0, do opory o chyt sa zapája aj stredný článok (dvojčlánkový kontakt), ktorý preberá časť normálovej sily, stabilizuje pútko A3 a znižuje vonkajší ohybový moment v DIP kĺbe takmer na nulu.</w:t>
       </w:r>
     </w:p>
     <w:p>
@@ -4215,7 +4270,7 @@
           <w:color w:val="2F5597"/>
           <w:sz w:val="26"/>
         </w:rPr>
-        <w:t>3.1 Deti (pediatrická kategória: &lt;12–13 rokov / prepubertálne obdobie)</w:t>
+        <w:t>3.1 Deti (do 12–13 rokov / predpubertálne obdobie)</w:t>
       </w:r>
     </w:p>
     <w:p>
@@ -4231,7 +4286,7 @@
           <w:i w:val="0"/>
           <w:sz w:val="24"/>
         </w:rPr>
-        <w:t>Dĺžka pák článkov a škálovanie hĺbky chytu (d / L_DP):</w:t>
+        <w:t>Dĺžka článkov prsta a relatívna hĺbka chytu (d / L_DP):</w:t>
       </w:r>
     </w:p>
     <w:p>
@@ -4256,7 +4311,7 @@
           <w:i w:val="0"/>
           <w:sz w:val="24"/>
         </w:rPr>
-        <w:t>Detské články prstov sú proporčne miniatúrne: L_DP ≈ 13–16 mm, s celkovou dĺžkou prsta L_tot ≈ 50–65 mm (v porovnaní s 22 mm a 95 mm u dospelých).</w:t>
+        <w:t>Články detských prstov sú výrazne kratšie: L_DP ≈ 13–16 mm pri celkovej dĺžke prsta L_tot ≈ 50–65 mm (oproti 22 mm a 95 mm u dospelého).</w:t>
       </w:r>
     </w:p>
     <w:p>
@@ -4281,16 +4336,16 @@
           <w:i w:val="0"/>
           <w:sz w:val="24"/>
         </w:rPr>
-        <w:t xml:space="preserve">Paradox obrátenia dospelých chytov: </w:t>
-      </w:r>
-      <w:r>
-        <w:rPr>
-          <w:rFonts w:ascii="Times New Roman" w:hAnsi="Times New Roman"/>
-          <w:b w:val="0"/>
-          <w:i w:val="0"/>
-          <w:sz w:val="24"/>
-        </w:rPr>
-        <w:t>Na štandardných chytoch v lezeckých centrách pre dospelých (18–22 mm lišty) je pomer hĺbky chytu pre dieťa ρ = d / L_DP &gt; 1,2–1,5. To, čo je pre dospelého „lišta“, funguje pre dieťa ako hlboká viacčlánková polica, kde sa stredný článok prirodzene opiera o chyt.</w:t>
+        <w:t xml:space="preserve">Výhoda na bežných chytoch pre dospelých: </w:t>
+      </w:r>
+      <w:r>
+        <w:rPr>
+          <w:rFonts w:ascii="Times New Roman" w:hAnsi="Times New Roman"/>
+          <w:b w:val="0"/>
+          <w:i w:val="0"/>
+          <w:sz w:val="24"/>
+        </w:rPr>
+        <w:t>Na štandardných lištách v lezeckých centrách (18–22 mm) dosahuje pomer hĺbky chytu u dieťaťa hodnotu ρ = d / L_DP &gt; 1,2–1,5. Chyt, ktorý je pre dospelého lištou, tak pre dieťa predstavuje dobrý chyt, na ktorom sa o povrch chytu prirodzene opiera aj stredný článok.</w:t>
       </w:r>
     </w:p>
     <w:p>
@@ -4324,7 +4379,7 @@
           <w:i w:val="0"/>
           <w:sz w:val="24"/>
         </w:rPr>
-        <w:t>Naopak, ak stavitelia ciest alebo mládežnícke súťaže zaradia plytké chyty zmenšené na 6–10 mm, pomer klesá na ρ ≤ 0,6, čo koncentruje silu priamo na špičku distálneho článku.</w:t>
+        <w:t>Ak však stavitelia ciest na tréningu alebo mládežníckych pretekoch použijú plytké lišty (6–10 mm), pomer klesá na ρ ≤ 0,6 a celé zaťaženie sa sústredí na koncový článok prsta.</w:t>
       </w:r>
     </w:p>
     <w:p>
@@ -4340,7 +4395,7 @@
           <w:i w:val="0"/>
           <w:sz w:val="24"/>
         </w:rPr>
-        <w:t>Zraniteľnosť rastovej platničky voči pákam (PPSI / epifyziolýza):</w:t>
+        <w:t>Náchylnosť rastových platničiek na pákové zaťaženie (PPSI / epifyziolýza):</w:t>
       </w:r>
     </w:p>
     <w:p>
@@ -4365,7 +4420,7 @@
           <w:i w:val="0"/>
           <w:sz w:val="24"/>
         </w:rPr>
-        <w:t>Epifyzárna rastová platnička (fýza) na báze stredného článku pozostáva z neosifikovaných chrupavkových chondrocytov, ktoré predstavujú mechanicky najslabší článok detského skeletu.</w:t>
+        <w:t>Rastová platnička (fýza) na báze stredného článku je tvorená neosifikovanou chrupavkou, ktorá predstavuje mechanicky najzraniteľnejšie miesto detskej ruky.</w:t>
       </w:r>
     </w:p>
     <w:p>
@@ -4390,7 +4445,7 @@
           <w:i w:val="0"/>
           <w:sz w:val="24"/>
         </w:rPr>
-        <w:t>Pri uzavretom úchope vytvára vysoká hyperextenzia v DIP a flexia v PIP kĺbe výrazné dorzálne strihové napätie priamo cez otvorenú rastovú štrbinu. Opakovaná mikrotrauma môže vyvolať chronické stresové poškodenie epifýzy na báze stredného článku (Primary Periphyseal Stress Injury – PPSI stupne 1–5; Schöffl et al., 2025).</w:t>
+        <w:t>Pri zamknutom úchope (full crimp) vyvoláva kombinácia hyperextenzie v DIP kĺbe a ostrého ohybu v PIP kĺbe vysoké strihové napätie priamo v neuzavretej rastovej štrbine. Opakované preťažovanie môže viesť k únavovým zlomeninám a poškodeniu rastovej platničky na báze stredného článku (Primary Periphyseal Stress Injury – PPSI, stupne 1–5; Schöffl et al., 2025).</w:t>
       </w:r>
     </w:p>
     <w:p>
@@ -4406,7 +4461,7 @@
           <w:i w:val="0"/>
           <w:sz w:val="24"/>
         </w:rPr>
-        <w:t>Praktické odporúčania podložené dôkazmi:</w:t>
+        <w:t>Odporúčania pre tréningovú prax:</w:t>
       </w:r>
     </w:p>
     <w:p>
@@ -4431,16 +4486,16 @@
           <w:i w:val="0"/>
           <w:sz w:val="24"/>
         </w:rPr>
-        <w:t xml:space="preserve">Dôrazné obmedzenie izolovaných visov na hangboarde a mikro-líšt: </w:t>
-      </w:r>
-      <w:r>
-        <w:rPr>
-          <w:rFonts w:ascii="Times New Roman" w:hAnsi="Times New Roman"/>
-          <w:b w:val="0"/>
-          <w:i w:val="0"/>
-          <w:sz w:val="24"/>
-        </w:rPr>
-        <w:t>Pre prepubertálne deti sa neodporúčajú cielené protokoly na hangboarde, kampusové silové rebríky ani visy s pridanou záťažou, aby sa chránili otvorené rastové platničky.</w:t>
+        <w:t xml:space="preserve">Vynechanie izolovaných visov na hangboarde a mikro-líšt: </w:t>
+      </w:r>
+      <w:r>
+        <w:rPr>
+          <w:rFonts w:ascii="Times New Roman" w:hAnsi="Times New Roman"/>
+          <w:b w:val="0"/>
+          <w:i w:val="0"/>
+          <w:sz w:val="24"/>
+        </w:rPr>
+        <w:t>U predpubertálnych detí sa na ochranu neuzavretých rastových platničiek neodporúča zaraďovať izolované visy na hangboarde, cvičenia na campuse (campus boarde) ani lezenie s pridanou záťažou.</w:t>
       </w:r>
     </w:p>
     <w:p>
@@ -4465,16 +4520,16 @@
           <w:i w:val="0"/>
           <w:sz w:val="24"/>
         </w:rPr>
-        <w:t xml:space="preserve">Geometria chytov a podpora dvoch článkov (d ≥ L_DP): </w:t>
-      </w:r>
-      <w:r>
-        <w:rPr>
-          <w:rFonts w:ascii="Times New Roman" w:hAnsi="Times New Roman"/>
-          <w:b w:val="0"/>
-          <w:i w:val="0"/>
-          <w:sz w:val="24"/>
-        </w:rPr>
-        <w:t>Odporúča sa preferovať ergonomické chyty (d ≥ 20 mm), obliny, štruktúry a kompresné tvary, kde sa stredný článok podieľa na kontakte (ρ &gt; 1,0).</w:t>
+        <w:t xml:space="preserve">Voľba chytov s oporou dvoch článkov (d ≥ L_DP): </w:t>
+      </w:r>
+      <w:r>
+        <w:rPr>
+          <w:rFonts w:ascii="Times New Roman" w:hAnsi="Times New Roman"/>
+          <w:b w:val="0"/>
+          <w:i w:val="0"/>
+          <w:sz w:val="24"/>
+        </w:rPr>
+        <w:t>V tréningu detí sa odporúča uprednostniť väčšie ergonomické chyty (d ≥ 20 mm), obliny, štruktúry a stisky, pri ktorých sa o chyt opiera aj stredný článok (ρ &gt; 1,0).</w:t>
       </w:r>
     </w:p>
     <w:p>
@@ -4494,7 +4549,7 @@
           <w:color w:val="2F5597"/>
           <w:sz w:val="26"/>
         </w:rPr>
-        <w:t>3.2 Juniori a dospievajúci (pubertálna kategória: ~13–18 rokov / rastový špurt)</w:t>
+        <w:t>3.2 Mládež a juniori (13–18 rokov / rastový špurt)</w:t>
       </w:r>
     </w:p>
     <w:p>
@@ -4510,7 +4565,7 @@
           <w:i w:val="0"/>
           <w:sz w:val="24"/>
         </w:rPr>
-        <w:t>„Nárast pákových ramien“ počas vrcholu výškovej rýchlosti (PHV):</w:t>
+        <w:t>Rýchle predlžovanie pák v období vrcholu rastového špurtu (PHV):</w:t>
       </w:r>
     </w:p>
     <w:p>
@@ -4535,7 +4590,7 @@
           <w:i w:val="0"/>
           <w:sz w:val="24"/>
         </w:rPr>
-        <w:t>Počas obdobia najrýchlejšieho rastu (Peak Height Velocity – PHV) rýchly pozdĺžny rast článkov prstov predlžuje vonkajšie páky rýchlejšie, než stíha prebiehať remodelácia šliach a fýz.</w:t>
+        <w:t>Počas obdobia najrýchlejšieho rastu do výšky (Peak Height Velocity – PHV) sa články prstov predlžujú rýchlejšie, než sa dokážu prispôsobiť a spevnieť šľachy, pútka a rastové platničky.</w:t>
       </w:r>
     </w:p>
     <w:p>
@@ -4560,16 +4615,16 @@
           <w:i w:val="0"/>
           <w:sz w:val="24"/>
         </w:rPr>
-        <w:t xml:space="preserve">Dominantná zraniteľnosť (PPSI): </w:t>
-      </w:r>
-      <w:r>
-        <w:rPr>
-          <w:rFonts w:ascii="Times New Roman" w:hAnsi="Times New Roman"/>
-          <w:b w:val="0"/>
-          <w:i w:val="0"/>
-          <w:sz w:val="24"/>
-        </w:rPr>
-        <w:t>Športovo-medicínsky výskum (Schöffl et al., 2023, 2025) ukazuje, že akútne ruptúry anulárnych pútok sú u adolescentov pomerne zriedkavé; primárnym miestom zlyhania býva otvorená fýza na báze stredného článku (klasifikovaná škálou PPSI stupne 1–5).</w:t>
+        <w:t xml:space="preserve">Hlavné riziko – stresové poranenia rastovej platničky (PPSI): </w:t>
+      </w:r>
+      <w:r>
+        <w:rPr>
+          <w:rFonts w:ascii="Times New Roman" w:hAnsi="Times New Roman"/>
+          <w:b w:val="0"/>
+          <w:i w:val="0"/>
+          <w:sz w:val="24"/>
+        </w:rPr>
+        <w:t>Štúdie zo športovej medicíny (Schöffl et al., 2023, 2025) ukazujú, že akútne ruptúry anulárnych pútok sú u dospievajúcich lezcov pomerne zriedkavé; najčastejším miestom poškodenia zostáva ešte neuzavretá rastová platnička (fýza) na báze stredného článku (klasifikácia PPSI, stupne 1–5).</w:t>
       </w:r>
     </w:p>
     <w:p>
@@ -4585,7 +4640,7 @@
           <w:i w:val="0"/>
           <w:sz w:val="24"/>
         </w:rPr>
-        <w:t>Praktické odporúčania podložené dôkazmi:</w:t>
+        <w:t>Odporúčania pre tréningovú prax:</w:t>
       </w:r>
     </w:p>
     <w:p>
@@ -4619,7 +4674,7 @@
           <w:i w:val="0"/>
           <w:sz w:val="24"/>
         </w:rPr>
-        <w:t>Odporúča sa sledovať trendy telesnej výšky a rastu prstov na identifikáciu fázy PHV (&gt;6–8 cm/rok) a počas rastových špurtov zmierniť objem lištovania.</w:t>
+        <w:t>Trénerom a rodičom sa odporúča priebežne sledovať prírastky telesnej výšky a dĺžky ruky. V období prudkého rastu (&gt;6–8 cm za rok) je vhodné dočasne znížiť objem lezenia na malých lištách a v zamknutom úchope.</w:t>
       </w:r>
     </w:p>
     <w:p>
@@ -4644,16 +4699,16 @@
           <w:i w:val="0"/>
           <w:sz w:val="24"/>
         </w:rPr>
-        <w:t xml:space="preserve">Konzervatívny tréning na hangboarde na podporných lištách (d ≥ 20 mm): </w:t>
-      </w:r>
-      <w:r>
-        <w:rPr>
-          <w:rFonts w:ascii="Times New Roman" w:hAnsi="Times New Roman"/>
-          <w:b w:val="0"/>
-          <w:i w:val="0"/>
-          <w:sz w:val="24"/>
-        </w:rPr>
-        <w:t>Vhodné je uprednostniť visy s vlastnou telesnou hmotnosťou na dostatočne hlbokých lištách (d ≥ 20–25 mm, ρ ≥ 1,0) v otvorenom úchope alebo uvoľnenej polovičnej lište; dynamické kampusové skoky je vhodné odložiť až po dosiahnutí kostrovej zrelosti.</w:t>
+        <w:t xml:space="preserve">Opatrný prístup k hangboardu na hlbších lištách (d ≥ 20 mm): </w:t>
+      </w:r>
+      <w:r>
+        <w:rPr>
+          <w:rFonts w:ascii="Times New Roman" w:hAnsi="Times New Roman"/>
+          <w:b w:val="0"/>
+          <w:i w:val="0"/>
+          <w:sz w:val="24"/>
+        </w:rPr>
+        <w:t>Ak sa u staršej mládeže zaraďuje tréning na hangboarde, odporúčajú sa visy s vlastnou hmotnosťou na dostatočne hlbokých lištách (d ≥ 20–25 mm, ρ ≥ 1,0) v otvorenom úchope alebo v polouzamknutom úchope (half-crimp); dynamické skoky na campuse je vhodné odložiť až do ukončenia kostrového rastu.</w:t>
       </w:r>
     </w:p>
     <w:p>
@@ -4673,7 +4728,7 @@
           <w:color w:val="2F5597"/>
           <w:sz w:val="26"/>
         </w:rPr>
-        <w:t>3.3 Dospelí a hlavná kategória (~18–45 rokov / kostrová zrelosť)</w:t>
+        <w:t>3.3 Dospelí lezci (18–45 rokov / kostrová zrelosť)</w:t>
       </w:r>
     </w:p>
     <w:p>
@@ -4689,7 +4744,7 @@
           <w:i w:val="0"/>
           <w:sz w:val="24"/>
         </w:rPr>
-        <w:t>Fixná dĺžka článkov a fenotypové škálovanie (L_tot ∈ [80, 110 mm]):</w:t>
+        <w:t>Ustálená dĺžka článkov a rozdiely medzi morfotypmi (L_tot ∈ [80, 110 mm]):</w:t>
       </w:r>
     </w:p>
     <w:p>
@@ -4714,7 +4769,7 @@
           <w:i w:val="0"/>
           <w:sz w:val="24"/>
         </w:rPr>
-        <w:t>Pri realistickom sublineárnom alometrickom škálovaní (ma ∝ L^0,50) majú dlhšie prsty prirodzenú +17,7 % mechanickú nevýhodu na mikro-lištách (297,3 N oproti 252,6 N na 6 mm lište pri záťaži 100 N).</w:t>
+        <w:t>Pri sublineárnom alometrickom škálovaní kĺbov (ma ∝ L^0,50) majú lezci s dlhšími prstami na mikro-lištách prirodzenú pákovú nevýhodu +17,7 % (297,3 N oproti 252,6 N na 6 mm lište pri rovnakom zaťažení 100 N).</w:t>
       </w:r>
     </w:p>
     <w:p>
@@ -4739,16 +4794,16 @@
           <w:i w:val="0"/>
           <w:sz w:val="24"/>
         </w:rPr>
-        <w:t xml:space="preserve">Dvojčlánkový kontakt na štandardných testovacích lištách (20 mm): </w:t>
-      </w:r>
-      <w:r>
-        <w:rPr>
-          <w:rFonts w:ascii="Times New Roman" w:hAnsi="Times New Roman"/>
-          <w:b w:val="0"/>
-          <w:i w:val="0"/>
-          <w:sz w:val="24"/>
-        </w:rPr>
-        <w:t>Lišta s hĺbkou 20 mm pôsobí ako dvojčlánková polica pre dospelého s krátkymi prstami (L_DP = 18,7 mm, ρ = 1,07, zaťaženie A2 218,0 N), ale zostáva jednočlánkovou lištou pre dospelého s dlhými prstami (L_DP = 25,3 mm, ρ = 0,79, zaťaženie A2 263,6 N, štrukturálna penalizácia +20,9 %).</w:t>
+        <w:t xml:space="preserve">Rozdielny kontakt na štandardnej 20 mm testovacej lište: </w:t>
+      </w:r>
+      <w:r>
+        <w:rPr>
+          <w:rFonts w:ascii="Times New Roman" w:hAnsi="Times New Roman"/>
+          <w:b w:val="0"/>
+          <w:i w:val="0"/>
+          <w:sz w:val="24"/>
+        </w:rPr>
+        <w:t>Pre dospelého lezca s krátkymi prstami (L_DP = 18,7 mm, ρ = 1,07) predstavuje 20 mm lišta dvojčlánkový chyt so zaťažením pútka A2 na úrovni 218,0 N, zatiaľ čo pre lezca s dlhými prstami (L_DP = 25,3 mm, ρ = 0,79) zostáva jednočlánkovou lištou so zaťažením pútka A2 až 263,6 N (nárast zaťaženia o +20,9 %).</w:t>
       </w:r>
     </w:p>
     <w:p>
@@ -4773,16 +4828,16 @@
           <w:i w:val="0"/>
           <w:sz w:val="24"/>
         </w:rPr>
-        <w:t xml:space="preserve">Alometrický nárast hmotnosti na malých lištách (10 mm): </w:t>
-      </w:r>
-      <w:r>
-        <w:rPr>
-          <w:rFonts w:ascii="Times New Roman" w:hAnsi="Times New Roman"/>
-          <w:b w:val="0"/>
-          <w:i w:val="0"/>
-          <w:sz w:val="24"/>
-        </w:rPr>
-        <w:t>Pri podpore telesnej hmotnosti škálovanej k výške (m ∝ L^2) zaznamenávajú lezci s dlhými prstami (92,5 kg) zaťaženie pútka A2 na úrovni 380,0 N na 10 mm lište v porovnaní so 174,2 N u lezcov s krátkymi prstami (50,6 kg) – čo predstavuje +118,1 % nárast absolútneho zaťaženia, približujúci sa k limitom ruptúry pútka (~400 N).</w:t>
+        <w:t xml:space="preserve">Vplyv vyššej telesnej hmotnosti na malých lištách (10 mm): </w:t>
+      </w:r>
+      <w:r>
+        <w:rPr>
+          <w:rFonts w:ascii="Times New Roman" w:hAnsi="Times New Roman"/>
+          <w:b w:val="0"/>
+          <w:i w:val="0"/>
+          <w:sz w:val="24"/>
+        </w:rPr>
+        <w:t>Pri zohľadnení rastu hmotnosti s výškou postavy (m ∝ L^2) pôsobí na pútko A2 pri vise na 10 mm lište u lezca s dlhými prstami (92,5 kg) sila 380,0 N, oproti 174,2 N u lezca s krátkymi prstami (50,6 kg) – ide o +118,1 % nárast absolútneho zaťaženia, ktorý sa blíži k medznej pevnosti pútka (~400 N).</w:t>
       </w:r>
     </w:p>
     <w:p>
@@ -4798,7 +4853,7 @@
           <w:i w:val="0"/>
           <w:sz w:val="24"/>
         </w:rPr>
-        <w:t>Praktické odporúčania podložené dôkazmi:</w:t>
+        <w:t>Odporúčania pre tréningovú prax:</w:t>
       </w:r>
     </w:p>
     <w:p>
@@ -4823,16 +4878,16 @@
           <w:i w:val="0"/>
           <w:sz w:val="24"/>
         </w:rPr>
-        <w:t xml:space="preserve">Kalibrácia objemu a regenerácie podľa fenotypu: </w:t>
-      </w:r>
-      <w:r>
-        <w:rPr>
-          <w:rFonts w:ascii="Times New Roman" w:hAnsi="Times New Roman"/>
-          <w:b w:val="0"/>
-          <w:i w:val="0"/>
-          <w:sz w:val="24"/>
-        </w:rPr>
-        <w:t>Lezcom s dlhými prstami vyhovujú regeneračné okná 48–72 hodín medzi náročnými tréningami na lištách.</w:t>
+        <w:t xml:space="preserve">Prispôsobenie objemu a regenerácie morfotypu: </w:t>
+      </w:r>
+      <w:r>
+        <w:rPr>
+          <w:rFonts w:ascii="Times New Roman" w:hAnsi="Times New Roman"/>
+          <w:b w:val="0"/>
+          <w:i w:val="0"/>
+          <w:sz w:val="24"/>
+        </w:rPr>
+        <w:t>Lezcom s dlhými prstami sa medzi náročnými tréningami na malých lištách odporúča dopriať 48 až 72 hodín odpočinku.</w:t>
       </w:r>
     </w:p>
     <w:p>
@@ -4857,16 +4912,16 @@
           <w:i w:val="0"/>
           <w:sz w:val="24"/>
         </w:rPr>
-        <w:t xml:space="preserve">Anatomická normalizácia líšt (d_test ≈ 0,80 L_DP): </w:t>
-      </w:r>
-      <w:r>
-        <w:rPr>
-          <w:rFonts w:ascii="Times New Roman" w:hAnsi="Times New Roman"/>
-          <w:b w:val="0"/>
-          <w:i w:val="0"/>
-          <w:sz w:val="24"/>
-        </w:rPr>
-        <w:t>Nastavenie hĺbky testovacej lišty podľa individuálnej dĺžky distálneho článku poskytuje biomechanicky spravodlivé a porovnateľné hodnotenie.</w:t>
+        <w:t xml:space="preserve">Individuálne prispôsobenie testovacej lišty (d_test ≈ 0,80 L_DP): </w:t>
+      </w:r>
+      <w:r>
+        <w:rPr>
+          <w:rFonts w:ascii="Times New Roman" w:hAnsi="Times New Roman"/>
+          <w:b w:val="0"/>
+          <w:i w:val="0"/>
+          <w:sz w:val="24"/>
+        </w:rPr>
+        <w:t>Voľba hĺbky testovacej lišty podľa dĺžky koncového článku zabezpečuje biomechanicky porovnateľné podmienky pri testovaní sily prstov.</w:t>
       </w:r>
     </w:p>
     <w:p>
@@ -4886,7 +4941,7 @@
           <w:color w:val="2F5597"/>
           <w:sz w:val="26"/>
         </w:rPr>
-        <w:t>3.4 Veteráni a masters (starší dospelí: 45–60+ rokov / pomalšia obnova tkanív)</w:t>
+        <w:t>3.4 Starší dospelí a kategória masters (nad 45 rokov)</w:t>
       </w:r>
     </w:p>
     <w:p>
@@ -4902,7 +4957,7 @@
           <w:i w:val="0"/>
           <w:sz w:val="24"/>
         </w:rPr>
-        <w:t>Kumulatívna celoživotná expozícia pák a kĺbové kontaktné napätie:</w:t>
+        <w:t>Dlhodobé kumulatívne zaťaženie kĺbov a opotrebovanie chrupaviek:</w:t>
       </w:r>
     </w:p>
     <w:p>
@@ -4927,7 +4982,7 @@
           <w:i w:val="0"/>
           <w:sz w:val="24"/>
         </w:rPr>
-        <w:t>Kumulatívne kĺbové kontaktné napätie (F_joint ≈ T_FDP + T_FDS + F_ext) rastie s dĺžkou pák a telesnou hmotnosťou, čo predisponuje starších lezcov k osteoartróze kĺbov PIP a DIP a k pomalšiemu obratu kolagénu.</w:t>
+        <w:t>Celková tlaková sila v kĺboch (F_joint ≈ T_FDP + T_FDS + F_ext) rastie s dĺžkou pák a telesnou hmotnosťou. Po rokoch lezenia to u starších lezcov zvyšuje náchylnosť na osteoartrózu PIP a DIP kĺbov, pričom prirodzená obnova kolagénu s vekom postupne spomaľuje.</w:t>
       </w:r>
     </w:p>
     <w:p>
@@ -4943,7 +4998,7 @@
           <w:i w:val="0"/>
           <w:sz w:val="24"/>
         </w:rPr>
-        <w:t>Praktické odporúčania podložené dôkazmi:</w:t>
+        <w:t>Odporúčania pre tréningovú prax:</w:t>
       </w:r>
     </w:p>
     <w:p>
@@ -4968,16 +5023,16 @@
           <w:i w:val="0"/>
           <w:sz w:val="24"/>
         </w:rPr>
-        <w:t xml:space="preserve">Zmenšenie pák pre dlhovekosť kĺbov: </w:t>
-      </w:r>
-      <w:r>
-        <w:rPr>
-          <w:rFonts w:ascii="Times New Roman" w:hAnsi="Times New Roman"/>
-          <w:b w:val="0"/>
-          <w:i w:val="0"/>
-          <w:sz w:val="24"/>
-        </w:rPr>
-        <w:t>Vhodné je preferovať otvorený úchop (open hand), ťah na troch prstoch (three-finger drag) a submaximálne kontrolované visy na hustotu spojiva (60–70 % MVC na lištách 20–25 mm) s dôkladným 20–30-minútovým progresívnym rozcvičením.</w:t>
+        <w:t xml:space="preserve">Šetrenie kĺbov zmenšením pákového zaťaženia: </w:t>
+      </w:r>
+      <w:r>
+        <w:rPr>
+          <w:rFonts w:ascii="Times New Roman" w:hAnsi="Times New Roman"/>
+          <w:b w:val="0"/>
+          <w:i w:val="0"/>
+          <w:sz w:val="24"/>
+        </w:rPr>
+        <w:t>Odporúča sa uprednostňovať otvorený úchop (open hand), úchop na troch prstoch (three-finger drag) a dlhšie, kontrolované submaximálne visy zamerané na adaptáciu šliach (60–70 % maxima na lištách 20–25 mm), vždy po dôkladnom 20 až 30-minútovom postupnom rozcvičení.</w:t>
       </w:r>
     </w:p>
     <w:p>
@@ -4997,7 +5052,7 @@
           <w:color w:val="2F5597"/>
           <w:sz w:val="26"/>
         </w:rPr>
-        <w:t>3.5 Zhrnutie: Celoživotné škálovanie pák článkov prstov a biomechanický rizikový profil</w:t>
+        <w:t>3.5 Prehľad pákových pomerov a rizík podľa veku</w:t>
       </w:r>
     </w:p>
     <w:p>
@@ -5012,7 +5067,7 @@
           <w:i/>
           <w:sz w:val="21"/>
         </w:rPr>
-        <w:t>Tabuľka 2: Celoživotné škálovanie pák článkov prstov a biomechanický rizikový profil</w:t>
+        <w:t>Tabuľka 2: Pákové pomery článkov prstov a rizikový profil podľa veku</w:t>
       </w:r>
     </w:p>
     <w:tbl>
@@ -5067,7 +5122,7 @@
                 <w:color w:val="1F3864"/>
                 <w:sz w:val="19"/>
               </w:rPr>
-              <w:t>Veková kohorta</w:t>
+              <w:t>Veková kategória</w:t>
             </w:r>
           </w:p>
         </w:tc>
@@ -5096,7 +5151,7 @@
                 <w:color w:val="1F3864"/>
                 <w:sz w:val="19"/>
               </w:rPr>
-              <w:t>Dynamika pák článkov</w:t>
+              <w:t>Vývoj dĺžky článkov (ΔL / Δt)</w:t>
             </w:r>
           </w:p>
         </w:tc>
@@ -5125,7 +5180,7 @@
                 <w:color w:val="1F3864"/>
                 <w:sz w:val="19"/>
               </w:rPr>
-              <w:t>Pomer hĺbky chytu (15 mm)</w:t>
+              <w:t>Relatívna hĺbka na 15 mm lište (ρ = d / L_DP)</w:t>
             </w:r>
           </w:p>
         </w:tc>
@@ -5154,7 +5209,7 @@
                 <w:color w:val="1F3864"/>
                 <w:sz w:val="19"/>
               </w:rPr>
-              <w:t>Škálovanie vnútorných síl</w:t>
+              <w:t>Vnútorné sily (T_FDP, F_A2)</w:t>
             </w:r>
           </w:p>
         </w:tc>
@@ -5183,7 +5238,7 @@
                 <w:color w:val="1F3864"/>
                 <w:sz w:val="19"/>
               </w:rPr>
-              <w:t>Primárny spôsob zlyhania</w:t>
+              <w:t>Najčastejšie miesto poškodenia</w:t>
             </w:r>
           </w:p>
         </w:tc>
@@ -5212,7 +5267,7 @@
                 <w:color w:val="1F3864"/>
                 <w:sz w:val="19"/>
               </w:rPr>
-              <w:t>Odporúčané zameranie úchopov</w:t>
+              <w:t>Odporúčania pre úchopy a tréning na hangboarde</w:t>
             </w:r>
           </w:p>
         </w:tc>
@@ -5245,7 +5300,7 @@
                 <w:i w:val="0"/>
                 <w:sz w:val="18"/>
               </w:rPr>
-              <w:t>Deti (&lt;12–13 r.)</w:t>
+              <w:t>Deti (do 12–13 r.)</w:t>
             </w:r>
           </w:p>
         </w:tc>
@@ -5273,7 +5328,7 @@
                 <w:i w:val="0"/>
                 <w:sz w:val="18"/>
               </w:rPr>
-              <w:t>Progresívny lineárny rast (L_tot ≈ 50–65 mm)</w:t>
+              <w:t>Plynulý rast (L_tot ≈ 50–65 mm)</w:t>
             </w:r>
           </w:p>
         </w:tc>
@@ -5301,7 +5356,7 @@
                 <w:i w:val="0"/>
                 <w:sz w:val="18"/>
               </w:rPr>
-              <w:t>ρ &gt; 1,0–1,2 (Hlboký chyt)</w:t>
+              <w:t>ρ &gt; 1,0–1,2 (bežné lišty pôsobia ako hlboké chyty)</w:t>
             </w:r>
           </w:p>
         </w:tc>
@@ -5329,7 +5384,7 @@
                 <w:i w:val="0"/>
                 <w:sz w:val="18"/>
               </w:rPr>
-              <w:t>Nízky absolútny moment, miniatúrne rameno šľachy</w:t>
+              <w:t>Nízky absolútny moment, ale malé vnútorné rameno šľachy (h ≈ 3 mm)</w:t>
             </w:r>
           </w:p>
         </w:tc>
@@ -5357,7 +5412,7 @@
                 <w:i w:val="0"/>
                 <w:sz w:val="18"/>
               </w:rPr>
-              <w:t>Neosifikovaná fýza na báze stredného článku (Epifyziolýza / PPSI)</w:t>
+              <w:t>Neuzavretá rastová platnička (fýza) na báze stredného článku (epifyziolýza / PPSI)</w:t>
             </w:r>
           </w:p>
         </w:tc>
@@ -5385,7 +5440,7 @@
                 <w:i w:val="0"/>
                 <w:sz w:val="18"/>
               </w:rPr>
-              <w:t>Vyhnúť sa izolovanému hangboardu a mikro-lištám; dôraz na madlá, obliny.</w:t>
+              <w:t>Vynechať izolovaný hangboard a mikro-lišty (d &lt; 12 mm); dôraz na všestrannosť, madlá a obliny.</w:t>
             </w:r>
           </w:p>
         </w:tc>
@@ -5418,7 +5473,7 @@
                 <w:i w:val="0"/>
                 <w:sz w:val="18"/>
               </w:rPr>
-              <w:t>Juniori (13–18 r.)</w:t>
+              <w:t>Mládež a juniori (13–18 r.)</w:t>
             </w:r>
           </w:p>
         </w:tc>
@@ -5446,7 +5501,7 @@
                 <w:i w:val="0"/>
                 <w:sz w:val="18"/>
               </w:rPr>
-              <w:t>Rýchly rastový špurt počas PHV</w:t>
+              <w:t>Prudký rastový špurt v období PHV</w:t>
             </w:r>
           </w:p>
         </w:tc>
@@ -5474,7 +5529,7 @@
                 <w:i w:val="0"/>
                 <w:sz w:val="18"/>
               </w:rPr>
-              <w:t>ρ ≈ 0,8–1,0 (Prechodová zóna)</w:t>
+              <w:t>ρ ≈ 0,8–1,0 (prechodová oblasť)</w:t>
             </w:r>
           </w:p>
         </w:tc>
@@ -5502,7 +5557,7 @@
                 <w:i w:val="0"/>
                 <w:sz w:val="18"/>
               </w:rPr>
-              <w:t>Prudký nárast momentu predstihujúci remodeláciu</w:t>
+              <w:t>Rýchly nárast momentu, ktorý predbieha adaptáciu šliach a kostí</w:t>
             </w:r>
           </w:p>
         </w:tc>
@@ -5530,7 +5585,7 @@
                 <w:i w:val="0"/>
                 <w:sz w:val="18"/>
               </w:rPr>
-              <w:t>Primárne perifyzárne stresové poranenie (PPSI 1–5); ruptúry pútok zriedkavé</w:t>
+              <w:t>Stresové poranenie rastovej platničky (PPSI 1–5); ruptúry pútok sú zriedkavé</w:t>
             </w:r>
           </w:p>
         </w:tc>
@@ -5558,7 +5613,7 @@
                 <w:i w:val="0"/>
                 <w:sz w:val="18"/>
               </w:rPr>
-              <w:t>Preferovať vlastnú váhu na hlbších lištách (≥ 20 mm); sledovať PHV.</w:t>
+              <w:t>Visy s vlastnou hmotnosťou na hlbších lištách (≥ 20 mm); sledovať rastový špurt; obmedziť dynamický campus.</w:t>
             </w:r>
           </w:p>
         </w:tc>
@@ -5619,7 +5674,7 @@
                 <w:i w:val="0"/>
                 <w:sz w:val="18"/>
               </w:rPr>
-              <w:t>Ustálená dĺžka; fenotypová variabilita (80–110 mm)</w:t>
+              <w:t>Ustálená dĺžka; rozdiely medzi morfotypmi (80–110 mm)</w:t>
             </w:r>
           </w:p>
         </w:tc>
@@ -5647,7 +5702,7 @@
                 <w:i w:val="0"/>
                 <w:sz w:val="18"/>
               </w:rPr>
-              <w:t>ρ ∈ [0,79; 1,07] (Citlivé na hĺbku)</w:t>
+              <w:t>ρ ∈ [0,79; 1,07] (výrazný vplyv hĺbky lišty)</w:t>
             </w:r>
           </w:p>
         </w:tc>
@@ -5675,7 +5730,7 @@
                 <w:i w:val="0"/>
                 <w:sz w:val="18"/>
               </w:rPr>
-              <w:t>Nevýhoda páky +17,7 %; +118,1 % nárast záťaže od hmotnosti</w:t>
+              <w:t>Páková nevýhoda +17,7 % pri rovnakej sile (ma ∝ L^0,50); +118,1 % nárast sily na pútko vplyvom hmotnosti</w:t>
             </w:r>
           </w:p>
         </w:tc>
@@ -5703,7 +5758,7 @@
                 <w:i w:val="0"/>
                 <w:sz w:val="18"/>
               </w:rPr>
-              <w:t>Akútna ruptúra pútka A2 pri rázovom zaťažení (&gt;400 N) a chronická tendovaginitída</w:t>
+              <w:t>Akútna ruptúra pútka A2 pri rázovom zaťažení (&gt;400 N) a chronický zápal šľachovej pošvy</w:t>
             </w:r>
           </w:p>
         </w:tc>
@@ -5731,7 +5786,7 @@
                 <w:i w:val="0"/>
                 <w:sz w:val="18"/>
               </w:rPr>
-              <w:t>Objem rešpektujúci fenotyp; normalizácia lišty (0,80 L_DP); otvorený úchop.</w:t>
+              <w:t>Dávkovanie objemu podľa morfotypu; prispôsobenie testovacej lišty (0,80 L_DP); prevaha otvoreného úchopu.</w:t>
             </w:r>
           </w:p>
         </w:tc>
@@ -5820,7 +5875,7 @@
                 <w:i w:val="0"/>
                 <w:sz w:val="18"/>
               </w:rPr>
-              <w:t>ρ ∈ [0,79; 1,07] (Citlivé na hĺbku)</w:t>
+              <w:t>ρ ∈ [0,79; 1,07] (výrazný vplyv hĺbky lišty)</w:t>
             </w:r>
           </w:p>
         </w:tc>
@@ -5848,7 +5903,7 @@
                 <w:i w:val="0"/>
                 <w:sz w:val="18"/>
               </w:rPr>
-              <w:t>Vysoké celoživotné kumulatívne kontaktné napätie</w:t>
+              <w:t>Vysoké kumulatívne tlakové zaťaženie v kĺboch počas života</w:t>
             </w:r>
           </w:p>
         </w:tc>
@@ -5876,7 +5931,7 @@
                 <w:i w:val="0"/>
                 <w:sz w:val="18"/>
               </w:rPr>
-              <w:t>Úbytok kĺbovej chrupavky, osteoartróza PIP kĺbu, pomalšia regenerácia</w:t>
+              <w:t>Opotrebovanie kĺbovej chrupavky, osteoartróza PIP kĺbu, pomalšia regenerácia</w:t>
             </w:r>
           </w:p>
         </w:tc>
@@ -5904,7 +5959,7 @@
                 <w:i w:val="0"/>
                 <w:sz w:val="18"/>
               </w:rPr>
-              <w:t>Zmiernenie pák (otvorený úchop / obliny); submaximálne visy; dlhší odpočinok.</w:t>
+              <w:t>Odľahčenie kĺbov (otvorený úchop / obliny); submaximálne visy; dlhšie rozcvičenie a regenerácia.</w:t>
             </w:r>
           </w:p>
         </w:tc>
@@ -5928,7 +5983,7 @@
           <w:color w:val="1F3864"/>
           <w:sz w:val="30"/>
         </w:rPr>
-        <w:t>4. Periodizácia zohľadňujúca fenotyp a návrh mikrocyklov [Biomechanická hypotéza a navrhovaný intervenčný rámec]</w:t>
+        <w:t>4. Periodizácia podľa morfotypu prsta a návrh mikrocyklov [Biomechanická hypotéza a navrhovaný metodický rámec]</w:t>
       </w:r>
     </w:p>
     <w:tbl>
@@ -5970,7 +6025,7 @@
                 <w:color w:val="1F4E79"/>
                 <w:sz w:val="22"/>
               </w:rPr>
-              <w:t>Kľúčová výskumná hranica: Preklenutie medzery v tréningu podľa fenotypu</w:t>
+              <w:t>Odborný prínos práce: Zohľadnenie morfotypu prsta v metodike tréningu</w:t>
             </w:r>
           </w:p>
           <w:p>
@@ -5983,7 +6038,7 @@
                 <w:rFonts w:ascii="Times New Roman" w:hAnsi="Times New Roman"/>
                 <w:sz w:val="21"/>
               </w:rPr>
-              <w:t>Systematické prehľady a meta-analýzy špecifického tréningu sily prstov v lezení (napr. Stien et al., 2023; Langer et al., 2023) a prelomové intervenčné štúdie (López-Rivera &amp; González-Badillo, 2012, 2019; Devise et al., 2022) potvrdzujú, že hangboardové protokoly vyvolávajú významné adaptácie. Všetky doterajšie vedecké intervencie však manipulovali výlučne s externými premennými – ako je absolútna záťaž, percento intenzity, hĺbka lišty či intervaly zaťaženia a odpočinku – pričom ľudský prst jednotne chápali ako nemennú, rovnakú páku. Žiadna doterajšia kontrolovaná empirická štúdia nepredpísala tréning na základe individuálnej dĺžky prstov, proporcií článkov či anatomického fenotypu.</w:t>
+              <w:t>Systematické prehľady a metaanalýzy zamerané na tréning sily prstov v lezení (napr. Stien et al., 2023; Langer et al., 2023) aj kľúčové tréningové štúdie (López-Rivera &amp; González-Badillo, 2012, 2019; Devise et al., 2022) potvrdzujú, že systematický tréning na hangboarde prináša výrazný nárast sily. Doterajšie výskumy však pracovali výlučne s vonkajšími parametrami tréningu – ako je veľkosť pridanej záťaže, intenzita, hĺbka lišty či trvanie intervalu práce a odpočinku – pričom k prstom všetkých lezcov pristupovali ako k rovnakej mechanickej páke. V odbornej literatúre doteraz chýbala metodika, ktorá by tréningové zaťaženie diferencovala podľa individuálnej dĺžky prstov, pomerov jednotlivých článkov a anatomického morfotypu.</w:t>
             </w:r>
           </w:p>
           <w:p>
@@ -5996,7 +6051,7 @@
                 <w:rFonts w:ascii="Times New Roman" w:hAnsi="Times New Roman"/>
                 <w:sz w:val="21"/>
               </w:rPr>
-              <w:t>Preklenutie tejto biomechanickej medzery je hlavným cieľom tejto práce. Zhodnotením 3D muskuloskeletálnej fyziky relatívneho kontaktu (ρ = d / L_DP), sublineárnej alometrie kondylov (+17,7 % rozdiel v páke), alometrického škálovania telesnej hmotnosti (+118,1 % nárast zaťaženia pútka) a kontaktnej mechaniky viacerých článkov poskytuje náš model trénerom, fyzioterapeutom a lezcom formalizovaný teoretický rámec pre individualizáciu tréningu prstov podľa fenotypu. Týždenné mikrocykly uvedené nižšie predstavujú štruktúrované, testovateľné hypotézy navrhnuté ako vodidlo pre budúce empirické intervenčné štúdie v športovej biomechanike.</w:t>
+              <w:t>Hlavným cieľom tejto práce je práve prepojenie týchto biomechanických súvislostí s tréningovou praxou. Zohľadnením pomeru hĺbky chytu k dĺžke koncového článku (ρ = d / L_DP), sublineárneho rastu kĺbov (+17,7 % rozdiel v páke), nárastu telesnej hmotnosti s výškou postavy (+118,1 % nárast zaťaženia pútka) a opory viacerých článkov prsta ponúka navrhnutý model trénerom, inštruktorom a lezcom ucelený teoretický základ pre individualizáciu tréningu podľa morfotypu. Nasledujúce parametre týždenného mikrocyklu predstavujú metodický návrh a zároveň odbornú hypotézu pre budúce empirické štúdie v športovej biomechanike.</w:t>
             </w:r>
           </w:p>
         </w:tc>
@@ -6016,7 +6071,7 @@
           <w:i w:val="0"/>
           <w:sz w:val="24"/>
         </w:rPr>
-        <w:t>Nasledujúca tabuľka ilustruje hypotetické rozdiely v periodizácii podľa morfológie ruky:</w:t>
+        <w:t>Nasledujúca tabuľka porovnáva odporúčané nastavenie tréningu pre dva krajné morfotypy ruky:</w:t>
       </w:r>
     </w:p>
     <w:p>
@@ -6031,7 +6086,7 @@
           <w:i/>
           <w:sz w:val="21"/>
         </w:rPr>
-        <w:t>Tabuľka 3: Hypotetické týždenné šablóny mikrocyklov podľa morfológie ruky</w:t>
+        <w:t>Tabuľka 3: Odporúčané nastavenie tréningového mikrocyklu podľa morfotypu ruky</w:t>
       </w:r>
     </w:p>
     <w:tbl>
@@ -6083,7 +6138,7 @@
                 <w:color w:val="1F3864"/>
                 <w:sz w:val="20"/>
               </w:rPr>
-              <w:t>Tréningová dimenzia</w:t>
+              <w:t>Tréningový parameter</w:t>
             </w:r>
           </w:p>
         </w:tc>
@@ -6112,7 +6167,7 @@
                 <w:color w:val="1F3864"/>
                 <w:sz w:val="20"/>
               </w:rPr>
-              <w:t>Krátky fenotyp (L_tot &lt; 85 mm)</w:t>
+              <w:t>Krátkoprstý morfotyp (L_tot &lt; 85 mm)</w:t>
             </w:r>
           </w:p>
         </w:tc>
@@ -6141,7 +6196,7 @@
                 <w:color w:val="1F3864"/>
                 <w:sz w:val="20"/>
               </w:rPr>
-              <w:t>Dlhý fenotyp (L_tot &gt; 105 mm)</w:t>
+              <w:t>Dlhoprstý morfotyp (L_tot &gt; 105 mm)</w:t>
             </w:r>
           </w:p>
         </w:tc>
@@ -6174,7 +6229,7 @@
                 <w:i w:val="0"/>
                 <w:sz w:val="19"/>
               </w:rPr>
-              <w:t>Frekvencia max. hangboardu</w:t>
+              <w:t>Frekvencia max. visov na hangboarde</w:t>
             </w:r>
           </w:p>
         </w:tc>
@@ -6202,7 +6257,7 @@
                 <w:i w:val="0"/>
                 <w:sz w:val="19"/>
               </w:rPr>
-              <w:t>2–3 tréningy / týždeň</w:t>
+              <w:t>2–3 tréningy týždenne</w:t>
             </w:r>
           </w:p>
         </w:tc>
@@ -6230,7 +6285,7 @@
                 <w:i w:val="0"/>
                 <w:sz w:val="19"/>
               </w:rPr>
-              <w:t>1–2 tréningy / týždeň max.</w:t>
+              <w:t>najviac 1–2 tréningy týždenne</w:t>
             </w:r>
           </w:p>
         </w:tc>
@@ -6263,7 +6318,7 @@
                 <w:i w:val="0"/>
                 <w:sz w:val="19"/>
               </w:rPr>
-              <w:t>Odpočinok medzi lištovaním</w:t>
+              <w:t>Odpočinok medzi intenzívnym lištovaním</w:t>
             </w:r>
           </w:p>
         </w:tc>
@@ -6319,7 +6374,7 @@
                 <w:i w:val="0"/>
                 <w:sz w:val="19"/>
               </w:rPr>
-              <w:t>48–72 hodín odporúčaných</w:t>
+              <w:t>odporúčaných 48–72 hodín</w:t>
             </w:r>
           </w:p>
         </w:tc>
@@ -6352,7 +6407,7 @@
                 <w:i w:val="0"/>
                 <w:sz w:val="19"/>
               </w:rPr>
-              <w:t>Preferovaná testovacia lišta</w:t>
+              <w:t>Odporúčaná testovacia lišta</w:t>
             </w:r>
           </w:p>
         </w:tc>
@@ -6441,7 +6496,7 @@
                 <w:i w:val="0"/>
                 <w:sz w:val="19"/>
               </w:rPr>
-              <w:t>Rozloženie úchopov</w:t>
+              <w:t>Pomer úchopov v tréningu</w:t>
             </w:r>
           </w:p>
         </w:tc>
@@ -6469,7 +6524,7 @@
                 <w:i w:val="0"/>
                 <w:sz w:val="19"/>
               </w:rPr>
-              <w:t>50 % polovičná lišta, 50 % otvorený úchop</w:t>
+              <w:t>50 % polouzamknutý úchop (half-crimp), 50 % otvorený úchop</w:t>
             </w:r>
           </w:p>
         </w:tc>
@@ -6497,7 +6552,7 @@
                 <w:i w:val="0"/>
                 <w:sz w:val="19"/>
               </w:rPr>
-              <w:t>75 % otvorený úchop, 25 % polovičná lišta</w:t>
+              <w:t>75 % otvorený úchop, 25 % polouzamknutý úchop (half-crimp)</w:t>
             </w:r>
           </w:p>
         </w:tc>
@@ -6530,7 +6585,7 @@
                 <w:i w:val="0"/>
                 <w:sz w:val="19"/>
               </w:rPr>
-              <w:t>Špecializácia na profily</w:t>
+              <w:t>Prirodzene vyhovujúci charakter lezenia</w:t>
             </w:r>
           </w:p>
         </w:tc>
@@ -6558,7 +6613,7 @@
                 <w:i w:val="0"/>
                 <w:sz w:val="19"/>
               </w:rPr>
-              <w:t>Lištové previsy, technické hrany</w:t>
+              <w:t>Previsy po malých lištách, technické steny</w:t>
             </w:r>
           </w:p>
         </w:tc>
@@ -6586,7 +6641,7 @@
                 <w:i w:val="0"/>
                 <w:sz w:val="19"/>
               </w:rPr>
-              <w:t>Obliny, kompresie, stisky</w:t>
+              <w:t>Obliny, kompresné lezenie, stisky</w:t>
             </w:r>
           </w:p>
         </w:tc>
@@ -6619,7 +6674,7 @@
                 <w:i w:val="0"/>
                 <w:sz w:val="19"/>
               </w:rPr>
-              <w:t>Makrocyklus spojivového tkaniva</w:t>
+              <w:t>Dĺžka adaptačného mezocyklu pre šľachy a pútka</w:t>
             </w:r>
           </w:p>
         </w:tc>
@@ -6647,7 +6702,7 @@
                 <w:i w:val="0"/>
                 <w:sz w:val="19"/>
               </w:rPr>
-              <w:t>6–8-týždňové bloky zaťaženia</w:t>
+              <w:t>6–8-týždňové tréningové bloky</w:t>
             </w:r>
           </w:p>
         </w:tc>
@@ -6675,7 +6730,7 @@
                 <w:i w:val="0"/>
                 <w:sz w:val="19"/>
               </w:rPr>
-              <w:t>12–16-týždňové pozvoľné nábehy</w:t>
+              <w:t>12–16-týždňové pozvoľné stupňovanie záťaže</w:t>
             </w:r>
           </w:p>
         </w:tc>
@@ -6699,7 +6754,7 @@
           <w:color w:val="1F3864"/>
           <w:sz w:val="30"/>
         </w:rPr>
-        <w:t>5. Stručný fyzikálny úvod: Veda v pozadí odporúčaní</w:t>
+        <w:t>5. Stručný fyzikálny prehľad: Teoretické východiská modelu</w:t>
       </w:r>
     </w:p>
     <w:p>
@@ -6715,7 +6770,7 @@
           <w:i w:val="0"/>
           <w:sz w:val="24"/>
         </w:rPr>
-        <w:t>Pre trénerov a lezcov, ktorých zaujímajú podkladové matematické formulácie, náš 3D model prepája štyri základné mechanické piliere:</w:t>
+        <w:t>Pre trénerov, inštruktorov a lezcov so záujmom o detailnejší pohľad na výpočtovú stránku práce sa navrhnutý 3D model opiera o štyri základné mechanické piliere:</w:t>
       </w:r>
     </w:p>
     <w:p>
@@ -6749,7 +6804,7 @@
           <w:i w:val="0"/>
           <w:sz w:val="24"/>
         </w:rPr>
-        <w:t>Kinematické transformačné matice mapujúce flexiu/extenziu v MCP kĺbe (θ_MCP), abdukciu/addukciu v MCP kĺbe (φ_MCP), flexiu v PIP kĺbe (θ_PIP) a flexiu v DIP kĺbe (θ_DIP).</w:t>
+        <w:t>Kinematické transformačné matice opisujúce ohyb a vystretie (flexiu/extenziu) v MCP kĺbe (θ_MCP), bočný odklon (abdukciu/addukciu) v MCP kĺbe (φ_MCP), ohyb v PIP kĺbe (θ_PIP) a ohyb v DIP kĺbe (θ_DIP).</w:t>
       </w:r>
     </w:p>
     <w:p>
@@ -6774,16 +6829,16 @@
           <w:i w:val="0"/>
           <w:sz w:val="24"/>
         </w:rPr>
-        <w:t xml:space="preserve">2. Kontaktná mechanika dvoch článkov: </w:t>
-      </w:r>
-      <w:r>
-        <w:rPr>
-          <w:rFonts w:ascii="Times New Roman" w:hAnsi="Times New Roman"/>
-          <w:b w:val="0"/>
-          <w:i w:val="0"/>
-          <w:sz w:val="24"/>
-        </w:rPr>
-        <w:t>Rieši distribúciu kontaktného tlaku na distálnom článku (s ≤ L_DP) a strednom článku (s &gt; L_DP). Zapojenie stredného článku aktivuje kostné ukotvenie pútka A3, čím posúva vonkajší moment pôsobiaci na DIP kĺb k nule.</w:t>
+        <w:t xml:space="preserve">2. Kontaktná mechanika jedného a dvoch článkov: </w:t>
+      </w:r>
+      <w:r>
+        <w:rPr>
+          <w:rFonts w:ascii="Times New Roman" w:hAnsi="Times New Roman"/>
+          <w:b w:val="0"/>
+          <w:i w:val="0"/>
+          <w:sz w:val="24"/>
+        </w:rPr>
+        <w:t>Výpočet rozloženia kontaktného tlaku na koncovom článku (s ≤ L_DP) a strednom článku (s &gt; L_DP). Pri opore stredného článku o chyt sa zapája pútko A3, čím vonkajší ohybový moment v DIP kĺbe klesá takmer na nulu.</w:t>
       </w:r>
     </w:p>
     <w:p>
@@ -6808,16 +6863,16 @@
           <w:i w:val="0"/>
           <w:sz w:val="24"/>
         </w:rPr>
-        <w:t xml:space="preserve">3. Presmerovanie šľachy na pútku (Capstan model): </w:t>
-      </w:r>
-      <w:r>
-        <w:rPr>
-          <w:rFonts w:ascii="Times New Roman" w:hAnsi="Times New Roman"/>
-          <w:b w:val="0"/>
-          <w:i w:val="0"/>
-          <w:sz w:val="24"/>
-        </w:rPr>
-        <w:t>Sila presmerovania šľachy na pútku sa počíta z vektorového vychýlenia cez príslušné kĺby:</w:t>
+        <w:t xml:space="preserve">3. Vychýlenie šľachy na pútku (kladkový / capstan model): </w:t>
+      </w:r>
+      <w:r>
+        <w:rPr>
+          <w:rFonts w:ascii="Times New Roman" w:hAnsi="Times New Roman"/>
+          <w:b w:val="0"/>
+          <w:i w:val="0"/>
+          <w:sz w:val="24"/>
+        </w:rPr>
+        <w:t>Normálová sila pôsobiaca na pútko vyplýva zo zmeny smeru šľachy pri prechode cez príslušné kĺby:</w:t>
       </w:r>
     </w:p>
     <w:p>
@@ -6890,16 +6945,16 @@
           <w:i w:val="0"/>
           <w:sz w:val="24"/>
         </w:rPr>
-        <w:t xml:space="preserve">4. Strihové namáhanie mimo sagitálnej roviny: </w:t>
-      </w:r>
-      <w:r>
-        <w:rPr>
-          <w:rFonts w:ascii="Times New Roman" w:hAnsi="Times New Roman"/>
-          <w:b w:val="0"/>
-          <w:i w:val="0"/>
-          <w:sz w:val="24"/>
-        </w:rPr>
-        <w:t>Nenulová radiálna abdukcia (φ_MCP ≠ 0) premieta vektor ťahu šľachy do koronálnej roviny, čo generuje bočné strihové sily (F_z) na vstupe do pútka A1 a na kolaterálnych väzoch PIP kĺbu.</w:t>
+        <w:t xml:space="preserve">4. Strihové zaťaženie mimo roviny ohybu: </w:t>
+      </w:r>
+      <w:r>
+        <w:rPr>
+          <w:rFonts w:ascii="Times New Roman" w:hAnsi="Times New Roman"/>
+          <w:b w:val="0"/>
+          <w:i w:val="0"/>
+          <w:sz w:val="24"/>
+        </w:rPr>
+        <w:t>Bočný odklon prsta v MCP kĺbe (φ_MCP ≠ 0) premieta silu ťahu šľachy do čelnej (koronálnej) roviny, čím vznikajú bočné strihové sily (F_z) na vstupe do pútka A1 a na kolaterálnych väzoch PIP kĺbu.</w:t>
       </w:r>
     </w:p>
     <w:p>
@@ -6919,7 +6974,7 @@
           <w:color w:val="1F3864"/>
           <w:sz w:val="30"/>
         </w:rPr>
-        <w:t>Záver: Dlhovekosť predchádza výkonu</w:t>
+        <w:t>Záver: Dlhodobo udržateľné zdravie ako predpoklad výkonnosti</w:t>
       </w:r>
     </w:p>
     <w:p>
@@ -6935,7 +6990,7 @@
           <w:i w:val="0"/>
           <w:sz w:val="24"/>
         </w:rPr>
-        <w:t>V športovom lezení je najsilnejším lezcom ten, kto dokáže trénovať konzistentne a dlhodobo bez vynútených prestávok spôsobených zraneniami. Regeneráciu a adaptáciu šliach a pútok nemožno unáhliť; ich metabolický obrat je rádovo pomalší ako u svalového tkaniva. Porozumením trojrozmernej fyzike prsta môžu lezci trénovať s vedeckým zámerom, chrániť svoje anatomické štruktúry a liezť náročnejšie cesty počas mnohých rokov.</w:t>
+        <w:t>V športovom lezení napreduje najrýchlejšie ten lezec, ktorý dokáže trénovať plynulo a dlhodobo bez nútených výpadkov spôsobených zraneniami. Adaptáciu šliach, pútok a kĺbových puzdier nemožno urýchliť – ich prestavba prebieha rádovo pomalšie než rast svalovej sily. Poznanie priestorovej biomechaniky prsta umožňuje trénerom a lezcom plánovať prípravu s rozvahou, chrániť pohybový aparát pred preťažením a posúvať vlastné lezecké limity počas mnohých rokov.</w:t>
       </w:r>
     </w:p>
     <w:p>
@@ -6971,7 +7026,7 @@
           <w:i w:val="0"/>
           <w:sz w:val="21"/>
         </w:rPr>
-        <w:t xml:space="preserve">Devise, M., Le Mansec, Y., Bideau, N., Bideau, N., Couceiro, M., Seifert, L., 2022. Comparison of finger flexor strength and endurance in rock climbers: a systematic review. Sports Biomech., 1–25. </w:t>
+        <w:t xml:space="preserve">Devise, M., Le Mansec, Y., Bideau, N., Couceiro, M., Seifert, L., 2022. Comparison of finger flexor strength and endurance in rock climbers: a systematic review. Sports Biomech., 1–25. </w:t>
       </w:r>
       <w:r>
         <w:rPr>

</xml_diff>